<commit_message>
Add main method logic to run the GCD program.
</commit_message>
<xml_diff>
--- a/Activity3/CST-250_Activity3_ChadGalloway.docx
+++ b/Activity3/CST-250_Activity3_ChadGalloway.docx
@@ -1893,8 +1893,13 @@
         <w:t>The only value changed to go from crashing</w:t>
       </w:r>
       <w:r>
-        <w:t xml:space="preserve"> to a reduction in calls was the number at the tail end of the return call to CountToOne</w:t>
-      </w:r>
+        <w:t xml:space="preserve"> to a reduction in calls was the number at the tail end of the return call to </w:t>
+      </w:r>
+      <w:proofErr w:type="spellStart"/>
+      <w:r>
+        <w:t>CountToOne</w:t>
+      </w:r>
+      <w:proofErr w:type="spellEnd"/>
     </w:p>
     <w:p>
       <w:pPr>
@@ -2073,7 +2078,15 @@
         <w:t xml:space="preserve">6: Code changes to get the extra divisions </w:t>
       </w:r>
       <w:r>
-        <w:t>running in the CountToOne() method.</w:t>
+        <w:t xml:space="preserve">running in the </w:t>
+      </w:r>
+      <w:proofErr w:type="spellStart"/>
+      <w:r>
+        <w:t>CountToOne</w:t>
+      </w:r>
+      <w:proofErr w:type="spellEnd"/>
+      <w:r>
+        <w:t>() method.</w:t>
       </w:r>
     </w:p>
     <w:p>
@@ -3984,8 +3997,6 @@
         <w:br w:type="page"/>
       </w:r>
     </w:p>
-    <w:p/>
-    <w:p/>
     <w:p>
       <w:pPr>
         <w:jc w:val="center"/>
@@ -4001,6 +4012,7 @@
           <w:sz w:val="28"/>
           <w:szCs w:val="28"/>
         </w:rPr>
+        <w:lastRenderedPageBreak/>
         <w:t>P</w:t>
       </w:r>
       <w:r>
@@ -4076,498 +4088,10 @@
           <w:noProof/>
         </w:rPr>
         <w:drawing>
-          <wp:inline distT="114300" distB="114300" distL="114300" distR="114300" wp14:anchorId="5F451F99" wp14:editId="79DA2C96">
-            <wp:extent cx="3148013" cy="1796373"/>
-            <wp:effectExtent l="0" t="0" r="0" b="0"/>
+          <wp:inline distT="114300" distB="114300" distL="114300" distR="114300" wp14:anchorId="5F451F99" wp14:editId="1E373681">
+            <wp:extent cx="5943600" cy="4608576"/>
+            <wp:effectExtent l="0" t="0" r="0" b="1905"/>
             <wp:docPr id="905574333" name="image1.jpg"/>
-            <wp:cNvGraphicFramePr/>
-            <a:graphic xmlns:a="http://schemas.openxmlformats.org/drawingml/2006/main">
-              <a:graphicData uri="http://schemas.openxmlformats.org/drawingml/2006/picture">
-                <pic:pic xmlns:pic="http://schemas.openxmlformats.org/drawingml/2006/picture">
-                  <pic:nvPicPr>
-                    <pic:cNvPr id="0" name="image1.jpg"/>
-                    <pic:cNvPicPr preferRelativeResize="0"/>
-                  </pic:nvPicPr>
-                  <pic:blipFill>
-                    <a:blip r:embed="rId38"/>
-                    <a:srcRect/>
-                    <a:stretch>
-                      <a:fillRect/>
-                    </a:stretch>
-                  </pic:blipFill>
-                  <pic:spPr>
-                    <a:xfrm>
-                      <a:off x="0" y="0"/>
-                      <a:ext cx="3148013" cy="1796373"/>
-                    </a:xfrm>
-                    <a:prstGeom prst="rect">
-                      <a:avLst/>
-                    </a:prstGeom>
-                    <a:ln/>
-                  </pic:spPr>
-                </pic:pic>
-              </a:graphicData>
-            </a:graphic>
-          </wp:inline>
-        </w:drawing>
-      </w:r>
-    </w:p>
-    <w:p>
-      <w:pPr>
-        <w:jc w:val="center"/>
-      </w:pPr>
-      <w:r>
-        <w:t xml:space="preserve">Figure </w:t>
-      </w:r>
-      <w:r>
-        <w:t>3-1</w:t>
-      </w:r>
-      <w:r>
-        <w:t>: Flow chart of XXXXXXX</w:t>
-      </w:r>
-    </w:p>
-    <w:p>
-      <w:pPr>
-        <w:jc w:val="center"/>
-      </w:pPr>
-    </w:p>
-    <w:p>
-      <w:r>
-        <w:rPr>
-          <w:lang w:val="en-US"/>
-        </w:rPr>
-        <w:t>"Lorem ipsum dolor sit amet, consectetur adipiscing elit, sed do eiusmod tempor incididunt ut labore et dolore magna aliqua. Ut enim ad minim veniam, quis nostrud exercitation ullamco laboris nisi ut aliquip ex ea commodo consequat. Duis aute irure dolor in reprehenderit in voluptate velit esse cillum dolore eu fugiat nulla pariatur. Excepteur sint occaecat cupidatat non proident, sunt in culpa qui officia deserunt mollit anim id est laborum."</w:t>
-      </w:r>
-    </w:p>
-    <w:p>
-      <w:r>
-        <w:br w:type="page"/>
-      </w:r>
-    </w:p>
-    <w:p/>
-    <w:p>
-      <w:pPr>
-        <w:jc w:val="center"/>
-        <w:rPr>
-          <w:sz w:val="28"/>
-          <w:szCs w:val="28"/>
-        </w:rPr>
-      </w:pPr>
-      <w:r>
-        <w:rPr>
-          <w:sz w:val="28"/>
-          <w:szCs w:val="28"/>
-        </w:rPr>
-        <w:t>UML Class Diagram</w:t>
-      </w:r>
-    </w:p>
-    <w:p>
-      <w:pPr>
-        <w:jc w:val="center"/>
-        <w:rPr>
-          <w:sz w:val="28"/>
-          <w:szCs w:val="28"/>
-        </w:rPr>
-      </w:pPr>
-    </w:p>
-    <w:p>
-      <w:pPr>
-        <w:jc w:val="center"/>
-      </w:pPr>
-      <w:r>
-        <w:rPr>
-          <w:noProof/>
-        </w:rPr>
-        <w:drawing>
-          <wp:inline distT="114300" distB="114300" distL="114300" distR="114300" wp14:anchorId="41ED67EF" wp14:editId="4BB915F6">
-            <wp:extent cx="3148013" cy="1796373"/>
-            <wp:effectExtent l="0" t="0" r="0" b="0"/>
-            <wp:docPr id="1955513105" name="image1.jpg"/>
-            <wp:cNvGraphicFramePr/>
-            <a:graphic xmlns:a="http://schemas.openxmlformats.org/drawingml/2006/main">
-              <a:graphicData uri="http://schemas.openxmlformats.org/drawingml/2006/picture">
-                <pic:pic xmlns:pic="http://schemas.openxmlformats.org/drawingml/2006/picture">
-                  <pic:nvPicPr>
-                    <pic:cNvPr id="0" name="image1.jpg"/>
-                    <pic:cNvPicPr preferRelativeResize="0"/>
-                  </pic:nvPicPr>
-                  <pic:blipFill>
-                    <a:blip r:embed="rId38"/>
-                    <a:srcRect/>
-                    <a:stretch>
-                      <a:fillRect/>
-                    </a:stretch>
-                  </pic:blipFill>
-                  <pic:spPr>
-                    <a:xfrm>
-                      <a:off x="0" y="0"/>
-                      <a:ext cx="3148013" cy="1796373"/>
-                    </a:xfrm>
-                    <a:prstGeom prst="rect">
-                      <a:avLst/>
-                    </a:prstGeom>
-                    <a:ln/>
-                  </pic:spPr>
-                </pic:pic>
-              </a:graphicData>
-            </a:graphic>
-          </wp:inline>
-        </w:drawing>
-      </w:r>
-    </w:p>
-    <w:p>
-      <w:pPr>
-        <w:jc w:val="center"/>
-      </w:pPr>
-      <w:r>
-        <w:t xml:space="preserve">Figure </w:t>
-      </w:r>
-      <w:r>
-        <w:t>3-2</w:t>
-      </w:r>
-      <w:r>
-        <w:t>: UML Class Diagram</w:t>
-      </w:r>
-    </w:p>
-    <w:p>
-      <w:pPr>
-        <w:jc w:val="center"/>
-      </w:pPr>
-    </w:p>
-    <w:p>
-      <w:r>
-        <w:rPr>
-          <w:lang w:val="en-US"/>
-        </w:rPr>
-        <w:t xml:space="preserve">Lorem ipsum dolor sit amet, consectetur adipiscing elit, sed do eiusmod tempor incididunt ut labore et dolore magna aliqua. </w:t>
-      </w:r>
-      <w:r>
-        <w:rPr>
-          <w:lang w:val="pt-BR"/>
-        </w:rPr>
-        <w:t xml:space="preserve">Ut enim ad minim veniam, quis nostrud exercitation ullamco laboris nisi ut aliquip ex ea commodo consequat. </w:t>
-      </w:r>
-      <w:r>
-        <w:rPr>
-          <w:lang w:val="en-US"/>
-        </w:rPr>
-        <w:t>Duis aute irure dolor in reprehenderit in voluptate velit esse cillum dolore eu fugiat nulla pariatur. Excepteur sint occaecat cupidatat non proident, sunt in culpa qui officia deserunt mollit anim id est laborum.</w:t>
-      </w:r>
-    </w:p>
-    <w:p>
-      <w:pPr>
-        <w:jc w:val="center"/>
-      </w:pPr>
-      <w:r>
-        <w:br w:type="page"/>
-      </w:r>
-    </w:p>
-    <w:p>
-      <w:pPr>
-        <w:jc w:val="center"/>
-        <w:rPr>
-          <w:sz w:val="28"/>
-          <w:szCs w:val="28"/>
-        </w:rPr>
-      </w:pPr>
-      <w:r>
-        <w:rPr>
-          <w:sz w:val="28"/>
-          <w:szCs w:val="28"/>
-        </w:rPr>
-        <w:lastRenderedPageBreak/>
-        <w:t>Screen Shots</w:t>
-      </w:r>
-    </w:p>
-    <w:p>
-      <w:pPr>
-        <w:jc w:val="center"/>
-        <w:rPr>
-          <w:sz w:val="28"/>
-          <w:szCs w:val="28"/>
-        </w:rPr>
-      </w:pPr>
-    </w:p>
-    <w:p>
-      <w:pPr>
-        <w:jc w:val="center"/>
-      </w:pPr>
-      <w:r>
-        <w:rPr>
-          <w:noProof/>
-        </w:rPr>
-        <w:drawing>
-          <wp:inline distT="114300" distB="114300" distL="114300" distR="114300" wp14:anchorId="168C6BEA" wp14:editId="2414B8EA">
-            <wp:extent cx="3148013" cy="1796373"/>
-            <wp:effectExtent l="0" t="0" r="0" b="0"/>
-            <wp:docPr id="1132534699" name="image1.jpg"/>
-            <wp:cNvGraphicFramePr/>
-            <a:graphic xmlns:a="http://schemas.openxmlformats.org/drawingml/2006/main">
-              <a:graphicData uri="http://schemas.openxmlformats.org/drawingml/2006/picture">
-                <pic:pic xmlns:pic="http://schemas.openxmlformats.org/drawingml/2006/picture">
-                  <pic:nvPicPr>
-                    <pic:cNvPr id="0" name="image1.jpg"/>
-                    <pic:cNvPicPr preferRelativeResize="0"/>
-                  </pic:nvPicPr>
-                  <pic:blipFill>
-                    <a:blip r:embed="rId38"/>
-                    <a:srcRect/>
-                    <a:stretch>
-                      <a:fillRect/>
-                    </a:stretch>
-                  </pic:blipFill>
-                  <pic:spPr>
-                    <a:xfrm>
-                      <a:off x="0" y="0"/>
-                      <a:ext cx="3148013" cy="1796373"/>
-                    </a:xfrm>
-                    <a:prstGeom prst="rect">
-                      <a:avLst/>
-                    </a:prstGeom>
-                    <a:ln/>
-                  </pic:spPr>
-                </pic:pic>
-              </a:graphicData>
-            </a:graphic>
-          </wp:inline>
-        </w:drawing>
-      </w:r>
-    </w:p>
-    <w:p>
-      <w:pPr>
-        <w:jc w:val="center"/>
-      </w:pPr>
-      <w:r>
-        <w:t xml:space="preserve">Figure X: Part </w:t>
-      </w:r>
-      <w:r>
-        <w:t>3</w:t>
-      </w:r>
-      <w:r>
-        <w:t xml:space="preserve"> App Running</w:t>
-      </w:r>
-    </w:p>
-    <w:p>
-      <w:pPr>
-        <w:jc w:val="center"/>
-      </w:pPr>
-    </w:p>
-    <w:p>
-      <w:pPr>
-        <w:rPr>
-          <w:lang w:val="en-US"/>
-        </w:rPr>
-      </w:pPr>
-      <w:r>
-        <w:rPr>
-          <w:lang w:val="en-US"/>
-        </w:rPr>
-        <w:t xml:space="preserve">Lorem ipsum dolor sit amet, consectetur adipiscing elit, sed do eiusmod tempor incididunt ut labore et dolore magna aliqua. </w:t>
-      </w:r>
-      <w:r>
-        <w:rPr>
-          <w:lang w:val="pt-BR"/>
-        </w:rPr>
-        <w:t xml:space="preserve">Ut enim ad minim veniam, quis nostrud exercitation ullamco laboris nisi ut aliquip ex ea commodo consequat. </w:t>
-      </w:r>
-      <w:r>
-        <w:rPr>
-          <w:lang w:val="en-US"/>
-        </w:rPr>
-        <w:t>Duis aute irure dolor in reprehenderit in voluptate velit esse cillum dolore eu fugiat nulla pariatur. Excepteur sint occaecat cupidatat non proident, sunt in culpa qui officia deserunt mollit anim id est laborum.</w:t>
-      </w:r>
-    </w:p>
-    <w:p/>
-    <w:p/>
-    <w:p>
-      <w:pPr>
-        <w:jc w:val="center"/>
-        <w:rPr>
-          <w:sz w:val="28"/>
-          <w:szCs w:val="28"/>
-        </w:rPr>
-      </w:pPr>
-    </w:p>
-    <w:p>
-      <w:pPr>
-        <w:jc w:val="center"/>
-      </w:pPr>
-      <w:r>
-        <w:rPr>
-          <w:noProof/>
-        </w:rPr>
-        <w:drawing>
-          <wp:inline distT="114300" distB="114300" distL="114300" distR="114300" wp14:anchorId="4A06B8BB" wp14:editId="7EE9C1F6">
-            <wp:extent cx="3148013" cy="1796373"/>
-            <wp:effectExtent l="0" t="0" r="0" b="0"/>
-            <wp:docPr id="1684668719" name="image1.jpg"/>
-            <wp:cNvGraphicFramePr/>
-            <a:graphic xmlns:a="http://schemas.openxmlformats.org/drawingml/2006/main">
-              <a:graphicData uri="http://schemas.openxmlformats.org/drawingml/2006/picture">
-                <pic:pic xmlns:pic="http://schemas.openxmlformats.org/drawingml/2006/picture">
-                  <pic:nvPicPr>
-                    <pic:cNvPr id="0" name="image1.jpg"/>
-                    <pic:cNvPicPr preferRelativeResize="0"/>
-                  </pic:nvPicPr>
-                  <pic:blipFill>
-                    <a:blip r:embed="rId38"/>
-                    <a:srcRect/>
-                    <a:stretch>
-                      <a:fillRect/>
-                    </a:stretch>
-                  </pic:blipFill>
-                  <pic:spPr>
-                    <a:xfrm>
-                      <a:off x="0" y="0"/>
-                      <a:ext cx="3148013" cy="1796373"/>
-                    </a:xfrm>
-                    <a:prstGeom prst="rect">
-                      <a:avLst/>
-                    </a:prstGeom>
-                    <a:ln/>
-                  </pic:spPr>
-                </pic:pic>
-              </a:graphicData>
-            </a:graphic>
-          </wp:inline>
-        </w:drawing>
-      </w:r>
-    </w:p>
-    <w:p>
-      <w:pPr>
-        <w:jc w:val="center"/>
-      </w:pPr>
-      <w:r>
-        <w:t>Figure X: Screenshot of successful output</w:t>
-      </w:r>
-    </w:p>
-    <w:p>
-      <w:pPr>
-        <w:jc w:val="center"/>
-      </w:pPr>
-    </w:p>
-    <w:p>
-      <w:r>
-        <w:rPr>
-          <w:lang w:val="en-US"/>
-        </w:rPr>
-        <w:t>Lorem ipsum dolor sit amet, consectetur adipiscing elit, sed do eiusmod tempor incididunt ut labore et dolore magna aliqua. Ut enim ad minim veniam, quis nostrud exercitation ullamco laboris nisi ut aliquip ex ea commodo consequat. Duis aute irure dolor in reprehenderit in voluptate velit esse cillum dolore eu fugiat nulla pariatur. Excepteur sint occaecat cupidatat non proident, sunt in culpa qui officia deserunt mollit anim id est laborum.</w:t>
-      </w:r>
-    </w:p>
-    <w:p/>
-    <w:p/>
-    <w:p>
-      <w:pPr>
-        <w:jc w:val="center"/>
-      </w:pPr>
-      <w:r>
-        <w:rPr>
-          <w:noProof/>
-        </w:rPr>
-        <w:lastRenderedPageBreak/>
-        <w:drawing>
-          <wp:inline distT="114300" distB="114300" distL="114300" distR="114300" wp14:anchorId="68C2E703" wp14:editId="1825469E">
-            <wp:extent cx="3148013" cy="1796373"/>
-            <wp:effectExtent l="0" t="0" r="0" b="0"/>
-            <wp:docPr id="1536500323" name="image1.jpg"/>
-            <wp:cNvGraphicFramePr/>
-            <a:graphic xmlns:a="http://schemas.openxmlformats.org/drawingml/2006/main">
-              <a:graphicData uri="http://schemas.openxmlformats.org/drawingml/2006/picture">
-                <pic:pic xmlns:pic="http://schemas.openxmlformats.org/drawingml/2006/picture">
-                  <pic:nvPicPr>
-                    <pic:cNvPr id="0" name="image1.jpg"/>
-                    <pic:cNvPicPr preferRelativeResize="0"/>
-                  </pic:nvPicPr>
-                  <pic:blipFill>
-                    <a:blip r:embed="rId38"/>
-                    <a:srcRect/>
-                    <a:stretch>
-                      <a:fillRect/>
-                    </a:stretch>
-                  </pic:blipFill>
-                  <pic:spPr>
-                    <a:xfrm>
-                      <a:off x="0" y="0"/>
-                      <a:ext cx="3148013" cy="1796373"/>
-                    </a:xfrm>
-                    <a:prstGeom prst="rect">
-                      <a:avLst/>
-                    </a:prstGeom>
-                    <a:ln/>
-                  </pic:spPr>
-                </pic:pic>
-              </a:graphicData>
-            </a:graphic>
-          </wp:inline>
-        </w:drawing>
-      </w:r>
-    </w:p>
-    <w:p>
-      <w:pPr>
-        <w:jc w:val="center"/>
-      </w:pPr>
-      <w:r>
-        <w:t>Figure X: Screenshot of Error Handling</w:t>
-      </w:r>
-    </w:p>
-    <w:p>
-      <w:pPr>
-        <w:jc w:val="center"/>
-      </w:pPr>
-    </w:p>
-    <w:p>
-      <w:r>
-        <w:rPr>
-          <w:lang w:val="en-US"/>
-        </w:rPr>
-        <w:t>Lorem ipsum dolor sit amet, consectetur adipiscing elit, sed do eiusmod tempor incididunt ut labore et dolore magna aliqua. Ut enim ad minim veniam, quis nostrud exercitation ullamco laboris nisi ut aliquip ex ea commodo consequat. Duis aute irure dolor in reprehenderit in voluptate velit esse cillum dolore eu fugiat nulla pariatur. Excepteur sint occaecat cupidatat non proident, sunt in culpa qui officia deserunt mollit anim id est laborum.</w:t>
-      </w:r>
-    </w:p>
-    <w:p/>
-    <w:p/>
-    <w:p/>
-    <w:p>
-      <w:pPr>
-        <w:jc w:val="center"/>
-        <w:rPr>
-          <w:sz w:val="28"/>
-          <w:szCs w:val="28"/>
-        </w:rPr>
-      </w:pPr>
-      <w:r>
-        <w:rPr>
-          <w:sz w:val="28"/>
-          <w:szCs w:val="28"/>
-        </w:rPr>
-        <w:t>Code</w:t>
-      </w:r>
-    </w:p>
-    <w:p>
-      <w:pPr>
-        <w:jc w:val="center"/>
-        <w:rPr>
-          <w:sz w:val="16"/>
-          <w:szCs w:val="16"/>
-        </w:rPr>
-      </w:pPr>
-    </w:p>
-    <w:p>
-      <w:pPr>
-        <w:jc w:val="center"/>
-        <w:rPr>
-          <w:sz w:val="28"/>
-          <w:szCs w:val="28"/>
-        </w:rPr>
-      </w:pPr>
-      <w:r>
-        <w:rPr>
-          <w:noProof/>
-        </w:rPr>
-        <w:drawing>
-          <wp:inline distT="114300" distB="114300" distL="114300" distR="114300" wp14:anchorId="42FD92A2" wp14:editId="14EF1BDC">
-            <wp:extent cx="5943710" cy="2651760"/>
-            <wp:effectExtent l="0" t="0" r="0" b="0"/>
-            <wp:docPr id="679253714" name="image1.jpg"/>
             <wp:cNvGraphicFramePr>
               <a:graphicFrameLocks xmlns:a="http://schemas.openxmlformats.org/drawingml/2006/main" noChangeAspect="1"/>
             </wp:cNvGraphicFramePr>
@@ -4575,11 +4099,11 @@
               <a:graphicData uri="http://schemas.openxmlformats.org/drawingml/2006/picture">
                 <pic:pic xmlns:pic="http://schemas.openxmlformats.org/drawingml/2006/picture">
                   <pic:nvPicPr>
-                    <pic:cNvPr id="1614527734" name="image1.jpg"/>
+                    <pic:cNvPr id="905574333" name="image1.jpg"/>
                     <pic:cNvPicPr/>
                   </pic:nvPicPr>
                   <pic:blipFill>
-                    <a:blip r:embed="rId10" cstate="print">
+                    <a:blip r:embed="rId38" cstate="print">
                       <a:extLst>
                         <a:ext uri="{28A0092B-C50C-407E-A947-70E740481C1C}">
                           <a14:useLocalDpi xmlns:a14="http://schemas.microsoft.com/office/drawing/2010/main" val="0"/>
@@ -4593,7 +4117,7 @@
                   <pic:spPr>
                     <a:xfrm>
                       <a:off x="0" y="0"/>
-                      <a:ext cx="5943710" cy="2651760"/>
+                      <a:ext cx="5943600" cy="4608576"/>
                     </a:xfrm>
                     <a:prstGeom prst="rect">
                       <a:avLst/>
@@ -4612,7 +4136,46 @@
         <w:jc w:val="center"/>
       </w:pPr>
       <w:r>
-        <w:t>Figure 6: Code Citations and the main method.</w:t>
+        <w:t xml:space="preserve">Figure </w:t>
+      </w:r>
+      <w:r>
+        <w:t>3-1</w:t>
+      </w:r>
+      <w:r>
+        <w:t xml:space="preserve">: Flow chart of </w:t>
+      </w:r>
+      <w:r>
+        <w:t>Activity 3 Part</w:t>
+      </w:r>
+      <w:r>
+        <w:t xml:space="preserve"> 3 greatest common divisor</w:t>
+      </w:r>
+    </w:p>
+    <w:p>
+      <w:pPr>
+        <w:jc w:val="center"/>
+      </w:pPr>
+    </w:p>
+    <w:p>
+      <w:r>
+        <w:br w:type="page"/>
+      </w:r>
+    </w:p>
+    <w:p/>
+    <w:p>
+      <w:pPr>
+        <w:jc w:val="center"/>
+        <w:rPr>
+          <w:sz w:val="28"/>
+          <w:szCs w:val="28"/>
+        </w:rPr>
+      </w:pPr>
+      <w:r>
+        <w:rPr>
+          <w:sz w:val="28"/>
+          <w:szCs w:val="28"/>
+        </w:rPr>
+        <w:t>UML Class Diagram</w:t>
       </w:r>
     </w:p>
     <w:p>
@@ -4632,12 +4195,11 @@
         <w:rPr>
           <w:noProof/>
         </w:rPr>
-        <w:lastRenderedPageBreak/>
         <w:drawing>
-          <wp:inline distT="0" distB="0" distL="0" distR="0" wp14:anchorId="340C7395" wp14:editId="5CBAD87E">
-            <wp:extent cx="5944235" cy="2651760"/>
+          <wp:inline distT="114300" distB="114300" distL="114300" distR="114300" wp14:anchorId="41ED67EF" wp14:editId="6ED3EDC1">
+            <wp:extent cx="5943600" cy="1929384"/>
             <wp:effectExtent l="0" t="0" r="0" b="0"/>
-            <wp:docPr id="1331373038" name="Picture 1"/>
+            <wp:docPr id="1955513105" name="image1.jpg"/>
             <wp:cNvGraphicFramePr>
               <a:graphicFrameLocks xmlns:a="http://schemas.openxmlformats.org/drawingml/2006/main" noChangeAspect="1"/>
             </wp:cNvGraphicFramePr>
@@ -4645,33 +4207,30 @@
               <a:graphicData uri="http://schemas.openxmlformats.org/drawingml/2006/picture">
                 <pic:pic xmlns:pic="http://schemas.openxmlformats.org/drawingml/2006/picture">
                   <pic:nvPicPr>
-                    <pic:cNvPr id="0" name="Picture 2"/>
-                    <pic:cNvPicPr>
-                      <a:picLocks noChangeAspect="1" noChangeArrowheads="1"/>
-                    </pic:cNvPicPr>
+                    <pic:cNvPr id="1955513105" name="image1.jpg"/>
+                    <pic:cNvPicPr/>
                   </pic:nvPicPr>
                   <pic:blipFill>
-                    <a:blip r:embed="rId11">
+                    <a:blip r:embed="rId39">
                       <a:extLst>
                         <a:ext uri="{28A0092B-C50C-407E-A947-70E740481C1C}">
                           <a14:useLocalDpi xmlns:a14="http://schemas.microsoft.com/office/drawing/2010/main" val="0"/>
                         </a:ext>
                       </a:extLst>
                     </a:blip>
-                    <a:srcRect/>
                     <a:stretch>
                       <a:fillRect/>
                     </a:stretch>
                   </pic:blipFill>
-                  <pic:spPr bwMode="auto">
+                  <pic:spPr>
                     <a:xfrm>
                       <a:off x="0" y="0"/>
-                      <a:ext cx="5944235" cy="2651760"/>
+                      <a:ext cx="5943600" cy="1929384"/>
                     </a:xfrm>
                     <a:prstGeom prst="rect">
                       <a:avLst/>
                     </a:prstGeom>
-                    <a:noFill/>
+                    <a:ln/>
                   </pic:spPr>
                 </pic:pic>
               </a:graphicData>
@@ -4685,13 +4244,222 @@
         <w:jc w:val="center"/>
       </w:pPr>
       <w:r>
-        <w:t>Figure 7: Utility class and the count to one method.</w:t>
-      </w:r>
-    </w:p>
-    <w:p>
-      <w:pPr>
-        <w:jc w:val="center"/>
-      </w:pPr>
+        <w:t xml:space="preserve">Figure </w:t>
+      </w:r>
+      <w:r>
+        <w:t>3-2</w:t>
+      </w:r>
+      <w:r>
+        <w:t>: UML Class Diagram</w:t>
+      </w:r>
+      <w:r>
+        <w:t xml:space="preserve"> </w:t>
+      </w:r>
+      <w:r>
+        <w:t>of Activity 3 Part 3 greatest common divisor</w:t>
+      </w:r>
+    </w:p>
+    <w:p>
+      <w:pPr>
+        <w:jc w:val="center"/>
+      </w:pPr>
+    </w:p>
+    <w:p>
+      <w:pPr>
+        <w:jc w:val="center"/>
+      </w:pPr>
+    </w:p>
+    <w:p>
+      <w:pPr>
+        <w:jc w:val="center"/>
+        <w:rPr>
+          <w:sz w:val="28"/>
+          <w:szCs w:val="28"/>
+        </w:rPr>
+      </w:pPr>
+      <w:r>
+        <w:rPr>
+          <w:sz w:val="28"/>
+          <w:szCs w:val="28"/>
+        </w:rPr>
+        <w:t>Screen Shots</w:t>
+      </w:r>
+    </w:p>
+    <w:p>
+      <w:pPr>
+        <w:jc w:val="center"/>
+        <w:rPr>
+          <w:sz w:val="16"/>
+          <w:szCs w:val="16"/>
+        </w:rPr>
+      </w:pPr>
+    </w:p>
+    <w:p>
+      <w:pPr>
+        <w:jc w:val="center"/>
+      </w:pPr>
+      <w:r>
+        <w:rPr>
+          <w:noProof/>
+        </w:rPr>
+        <w:drawing>
+          <wp:inline distT="114300" distB="114300" distL="114300" distR="114300" wp14:anchorId="4A06B8BB" wp14:editId="21453410">
+            <wp:extent cx="5943600" cy="3337560"/>
+            <wp:effectExtent l="0" t="0" r="0" b="0"/>
+            <wp:docPr id="1684668719" name="image1.jpg"/>
+            <wp:cNvGraphicFramePr>
+              <a:graphicFrameLocks xmlns:a="http://schemas.openxmlformats.org/drawingml/2006/main" noChangeAspect="1"/>
+            </wp:cNvGraphicFramePr>
+            <a:graphic xmlns:a="http://schemas.openxmlformats.org/drawingml/2006/main">
+              <a:graphicData uri="http://schemas.openxmlformats.org/drawingml/2006/picture">
+                <pic:pic xmlns:pic="http://schemas.openxmlformats.org/drawingml/2006/picture">
+                  <pic:nvPicPr>
+                    <pic:cNvPr id="1684668719" name="image1.jpg"/>
+                    <pic:cNvPicPr/>
+                  </pic:nvPicPr>
+                  <pic:blipFill>
+                    <a:blip r:embed="rId40" cstate="print">
+                      <a:extLst>
+                        <a:ext uri="{28A0092B-C50C-407E-A947-70E740481C1C}">
+                          <a14:useLocalDpi xmlns:a14="http://schemas.microsoft.com/office/drawing/2010/main" val="0"/>
+                        </a:ext>
+                      </a:extLst>
+                    </a:blip>
+                    <a:stretch>
+                      <a:fillRect/>
+                    </a:stretch>
+                  </pic:blipFill>
+                  <pic:spPr>
+                    <a:xfrm>
+                      <a:off x="0" y="0"/>
+                      <a:ext cx="5943600" cy="3337560"/>
+                    </a:xfrm>
+                    <a:prstGeom prst="rect">
+                      <a:avLst/>
+                    </a:prstGeom>
+                    <a:ln/>
+                  </pic:spPr>
+                </pic:pic>
+              </a:graphicData>
+            </a:graphic>
+          </wp:inline>
+        </w:drawing>
+      </w:r>
+    </w:p>
+    <w:p>
+      <w:pPr>
+        <w:jc w:val="center"/>
+      </w:pPr>
+      <w:r>
+        <w:t xml:space="preserve">Figure </w:t>
+      </w:r>
+      <w:r>
+        <w:t>3-3</w:t>
+      </w:r>
+      <w:r>
+        <w:t>: Screenshot of successful output</w:t>
+      </w:r>
+    </w:p>
+    <w:p>
+      <w:r>
+        <w:br w:type="page"/>
+      </w:r>
+    </w:p>
+    <w:p/>
+    <w:p>
+      <w:pPr>
+        <w:jc w:val="center"/>
+        <w:rPr>
+          <w:sz w:val="28"/>
+          <w:szCs w:val="28"/>
+        </w:rPr>
+      </w:pPr>
+      <w:r>
+        <w:rPr>
+          <w:sz w:val="28"/>
+          <w:szCs w:val="28"/>
+        </w:rPr>
+        <w:t>Code</w:t>
+      </w:r>
+    </w:p>
+    <w:p>
+      <w:pPr>
+        <w:jc w:val="center"/>
+        <w:rPr>
+          <w:sz w:val="16"/>
+          <w:szCs w:val="16"/>
+        </w:rPr>
+      </w:pPr>
+    </w:p>
+    <w:p>
+      <w:pPr>
+        <w:jc w:val="center"/>
+        <w:rPr>
+          <w:sz w:val="28"/>
+          <w:szCs w:val="28"/>
+        </w:rPr>
+      </w:pPr>
+      <w:r>
+        <w:rPr>
+          <w:noProof/>
+        </w:rPr>
+        <w:drawing>
+          <wp:inline distT="114300" distB="114300" distL="114300" distR="114300" wp14:anchorId="42FD92A2" wp14:editId="2CFECC41">
+            <wp:extent cx="5943600" cy="3438144"/>
+            <wp:effectExtent l="0" t="0" r="0" b="0"/>
+            <wp:docPr id="679253714" name="image1.jpg"/>
+            <wp:cNvGraphicFramePr>
+              <a:graphicFrameLocks xmlns:a="http://schemas.openxmlformats.org/drawingml/2006/main" noChangeAspect="1"/>
+            </wp:cNvGraphicFramePr>
+            <a:graphic xmlns:a="http://schemas.openxmlformats.org/drawingml/2006/main">
+              <a:graphicData uri="http://schemas.openxmlformats.org/drawingml/2006/picture">
+                <pic:pic xmlns:pic="http://schemas.openxmlformats.org/drawingml/2006/picture">
+                  <pic:nvPicPr>
+                    <pic:cNvPr id="679253714" name="image1.jpg"/>
+                    <pic:cNvPicPr/>
+                  </pic:nvPicPr>
+                  <pic:blipFill>
+                    <a:blip r:embed="rId41" cstate="print">
+                      <a:extLst>
+                        <a:ext uri="{28A0092B-C50C-407E-A947-70E740481C1C}">
+                          <a14:useLocalDpi xmlns:a14="http://schemas.microsoft.com/office/drawing/2010/main" val="0"/>
+                        </a:ext>
+                      </a:extLst>
+                    </a:blip>
+                    <a:stretch>
+                      <a:fillRect/>
+                    </a:stretch>
+                  </pic:blipFill>
+                  <pic:spPr>
+                    <a:xfrm>
+                      <a:off x="0" y="0"/>
+                      <a:ext cx="5943600" cy="3438144"/>
+                    </a:xfrm>
+                    <a:prstGeom prst="rect">
+                      <a:avLst/>
+                    </a:prstGeom>
+                    <a:ln/>
+                  </pic:spPr>
+                </pic:pic>
+              </a:graphicData>
+            </a:graphic>
+          </wp:inline>
+        </w:drawing>
+      </w:r>
+    </w:p>
+    <w:p>
+      <w:pPr>
+        <w:jc w:val="center"/>
+      </w:pPr>
+      <w:r>
+        <w:t xml:space="preserve">Figure </w:t>
+      </w:r>
+      <w:r>
+        <w:t>3-4</w:t>
+      </w:r>
+      <w:r>
+        <w:t>: Code Citations and the main method.</w:t>
+      </w:r>
       <w:r>
         <w:br w:type="page"/>
       </w:r>
@@ -4793,7 +4561,7 @@
                     </pic:cNvPicPr>
                   </pic:nvPicPr>
                   <pic:blipFill>
-                    <a:blip r:embed="rId39">
+                    <a:blip r:embed="rId42">
                       <a:extLst>
                         <a:ext uri="{28A0092B-C50C-407E-A947-70E740481C1C}">
                           <a14:useLocalDpi xmlns:a14="http://schemas.microsoft.com/office/drawing/2010/main" val="0"/>
@@ -5081,7 +4849,7 @@
                     <pic:cNvPicPr preferRelativeResize="0"/>
                   </pic:nvPicPr>
                   <pic:blipFill>
-                    <a:blip r:embed="rId38"/>
+                    <a:blip r:embed="rId43"/>
                     <a:srcRect/>
                     <a:stretch>
                       <a:fillRect/>
@@ -5122,7 +4890,595 @@
         <w:rPr>
           <w:lang w:val="en-US"/>
         </w:rPr>
-        <w:t>"Lorem ipsum dolor sit amet, consectetur adipiscing elit, sed do eiusmod tempor incididunt ut labore et dolore magna aliqua. Ut enim ad minim veniam, quis nostrud exercitation ullamco laboris nisi ut aliquip ex ea commodo consequat. Duis aute irure dolor in reprehenderit in voluptate velit esse cillum dolore eu fugiat nulla pariatur. Excepteur sint occaecat cupidatat non proident, sunt in culpa qui officia deserunt mollit anim id est laborum."</w:t>
+        <w:t xml:space="preserve">"Lorem ipsum dolor sit </w:t>
+      </w:r>
+      <w:proofErr w:type="spellStart"/>
+      <w:r>
+        <w:rPr>
+          <w:lang w:val="en-US"/>
+        </w:rPr>
+        <w:t>amet</w:t>
+      </w:r>
+      <w:proofErr w:type="spellEnd"/>
+      <w:r>
+        <w:rPr>
+          <w:lang w:val="en-US"/>
+        </w:rPr>
+        <w:t xml:space="preserve">, </w:t>
+      </w:r>
+      <w:proofErr w:type="spellStart"/>
+      <w:r>
+        <w:rPr>
+          <w:lang w:val="en-US"/>
+        </w:rPr>
+        <w:t>consectetur</w:t>
+      </w:r>
+      <w:proofErr w:type="spellEnd"/>
+      <w:r>
+        <w:rPr>
+          <w:lang w:val="en-US"/>
+        </w:rPr>
+        <w:t xml:space="preserve"> </w:t>
+      </w:r>
+      <w:proofErr w:type="spellStart"/>
+      <w:r>
+        <w:rPr>
+          <w:lang w:val="en-US"/>
+        </w:rPr>
+        <w:t>adipiscing</w:t>
+      </w:r>
+      <w:proofErr w:type="spellEnd"/>
+      <w:r>
+        <w:rPr>
+          <w:lang w:val="en-US"/>
+        </w:rPr>
+        <w:t xml:space="preserve"> </w:t>
+      </w:r>
+      <w:proofErr w:type="spellStart"/>
+      <w:r>
+        <w:rPr>
+          <w:lang w:val="en-US"/>
+        </w:rPr>
+        <w:t>elit</w:t>
+      </w:r>
+      <w:proofErr w:type="spellEnd"/>
+      <w:r>
+        <w:rPr>
+          <w:lang w:val="en-US"/>
+        </w:rPr>
+        <w:t xml:space="preserve">, sed do </w:t>
+      </w:r>
+      <w:proofErr w:type="spellStart"/>
+      <w:r>
+        <w:rPr>
+          <w:lang w:val="en-US"/>
+        </w:rPr>
+        <w:t>eiusmod</w:t>
+      </w:r>
+      <w:proofErr w:type="spellEnd"/>
+      <w:r>
+        <w:rPr>
+          <w:lang w:val="en-US"/>
+        </w:rPr>
+        <w:t xml:space="preserve"> </w:t>
+      </w:r>
+      <w:proofErr w:type="spellStart"/>
+      <w:r>
+        <w:rPr>
+          <w:lang w:val="en-US"/>
+        </w:rPr>
+        <w:t>tempor</w:t>
+      </w:r>
+      <w:proofErr w:type="spellEnd"/>
+      <w:r>
+        <w:rPr>
+          <w:lang w:val="en-US"/>
+        </w:rPr>
+        <w:t xml:space="preserve"> </w:t>
+      </w:r>
+      <w:proofErr w:type="spellStart"/>
+      <w:r>
+        <w:rPr>
+          <w:lang w:val="en-US"/>
+        </w:rPr>
+        <w:t>incididunt</w:t>
+      </w:r>
+      <w:proofErr w:type="spellEnd"/>
+      <w:r>
+        <w:rPr>
+          <w:lang w:val="en-US"/>
+        </w:rPr>
+        <w:t xml:space="preserve"> </w:t>
+      </w:r>
+      <w:proofErr w:type="spellStart"/>
+      <w:r>
+        <w:rPr>
+          <w:lang w:val="en-US"/>
+        </w:rPr>
+        <w:t>ut</w:t>
+      </w:r>
+      <w:proofErr w:type="spellEnd"/>
+      <w:r>
+        <w:rPr>
+          <w:lang w:val="en-US"/>
+        </w:rPr>
+        <w:t xml:space="preserve"> labore et dolore magna </w:t>
+      </w:r>
+      <w:proofErr w:type="spellStart"/>
+      <w:r>
+        <w:rPr>
+          <w:lang w:val="en-US"/>
+        </w:rPr>
+        <w:t>aliqua</w:t>
+      </w:r>
+      <w:proofErr w:type="spellEnd"/>
+      <w:r>
+        <w:rPr>
+          <w:lang w:val="en-US"/>
+        </w:rPr>
+        <w:t xml:space="preserve">. Ut </w:t>
+      </w:r>
+      <w:proofErr w:type="spellStart"/>
+      <w:r>
+        <w:rPr>
+          <w:lang w:val="en-US"/>
+        </w:rPr>
+        <w:t>enim</w:t>
+      </w:r>
+      <w:proofErr w:type="spellEnd"/>
+      <w:r>
+        <w:rPr>
+          <w:lang w:val="en-US"/>
+        </w:rPr>
+        <w:t xml:space="preserve"> ad minim </w:t>
+      </w:r>
+      <w:proofErr w:type="spellStart"/>
+      <w:r>
+        <w:rPr>
+          <w:lang w:val="en-US"/>
+        </w:rPr>
+        <w:t>veniam</w:t>
+      </w:r>
+      <w:proofErr w:type="spellEnd"/>
+      <w:r>
+        <w:rPr>
+          <w:lang w:val="en-US"/>
+        </w:rPr>
+        <w:t xml:space="preserve">, </w:t>
+      </w:r>
+      <w:proofErr w:type="spellStart"/>
+      <w:r>
+        <w:rPr>
+          <w:lang w:val="en-US"/>
+        </w:rPr>
+        <w:t>quis</w:t>
+      </w:r>
+      <w:proofErr w:type="spellEnd"/>
+      <w:r>
+        <w:rPr>
+          <w:lang w:val="en-US"/>
+        </w:rPr>
+        <w:t xml:space="preserve"> </w:t>
+      </w:r>
+      <w:proofErr w:type="spellStart"/>
+      <w:r>
+        <w:rPr>
+          <w:lang w:val="en-US"/>
+        </w:rPr>
+        <w:t>nostrud</w:t>
+      </w:r>
+      <w:proofErr w:type="spellEnd"/>
+      <w:r>
+        <w:rPr>
+          <w:lang w:val="en-US"/>
+        </w:rPr>
+        <w:t xml:space="preserve"> exercitation </w:t>
+      </w:r>
+      <w:proofErr w:type="spellStart"/>
+      <w:r>
+        <w:rPr>
+          <w:lang w:val="en-US"/>
+        </w:rPr>
+        <w:t>ullamco</w:t>
+      </w:r>
+      <w:proofErr w:type="spellEnd"/>
+      <w:r>
+        <w:rPr>
+          <w:lang w:val="en-US"/>
+        </w:rPr>
+        <w:t xml:space="preserve"> </w:t>
+      </w:r>
+      <w:proofErr w:type="spellStart"/>
+      <w:r>
+        <w:rPr>
+          <w:lang w:val="en-US"/>
+        </w:rPr>
+        <w:t>laboris</w:t>
+      </w:r>
+      <w:proofErr w:type="spellEnd"/>
+      <w:r>
+        <w:rPr>
+          <w:lang w:val="en-US"/>
+        </w:rPr>
+        <w:t xml:space="preserve"> nisi </w:t>
+      </w:r>
+      <w:proofErr w:type="spellStart"/>
+      <w:r>
+        <w:rPr>
+          <w:lang w:val="en-US"/>
+        </w:rPr>
+        <w:t>ut</w:t>
+      </w:r>
+      <w:proofErr w:type="spellEnd"/>
+      <w:r>
+        <w:rPr>
+          <w:lang w:val="en-US"/>
+        </w:rPr>
+        <w:t xml:space="preserve"> </w:t>
+      </w:r>
+      <w:proofErr w:type="spellStart"/>
+      <w:r>
+        <w:rPr>
+          <w:lang w:val="en-US"/>
+        </w:rPr>
+        <w:t>aliquip</w:t>
+      </w:r>
+      <w:proofErr w:type="spellEnd"/>
+      <w:r>
+        <w:rPr>
+          <w:lang w:val="en-US"/>
+        </w:rPr>
+        <w:t xml:space="preserve"> ex </w:t>
+      </w:r>
+      <w:proofErr w:type="spellStart"/>
+      <w:r>
+        <w:rPr>
+          <w:lang w:val="en-US"/>
+        </w:rPr>
+        <w:t>ea</w:t>
+      </w:r>
+      <w:proofErr w:type="spellEnd"/>
+      <w:r>
+        <w:rPr>
+          <w:lang w:val="en-US"/>
+        </w:rPr>
+        <w:t xml:space="preserve"> </w:t>
+      </w:r>
+      <w:proofErr w:type="spellStart"/>
+      <w:r>
+        <w:rPr>
+          <w:lang w:val="en-US"/>
+        </w:rPr>
+        <w:t>commodo</w:t>
+      </w:r>
+      <w:proofErr w:type="spellEnd"/>
+      <w:r>
+        <w:rPr>
+          <w:lang w:val="en-US"/>
+        </w:rPr>
+        <w:t xml:space="preserve"> </w:t>
+      </w:r>
+      <w:proofErr w:type="spellStart"/>
+      <w:r>
+        <w:rPr>
+          <w:lang w:val="en-US"/>
+        </w:rPr>
+        <w:t>consequat</w:t>
+      </w:r>
+      <w:proofErr w:type="spellEnd"/>
+      <w:r>
+        <w:rPr>
+          <w:lang w:val="en-US"/>
+        </w:rPr>
+        <w:t xml:space="preserve">. Duis </w:t>
+      </w:r>
+      <w:proofErr w:type="spellStart"/>
+      <w:r>
+        <w:rPr>
+          <w:lang w:val="en-US"/>
+        </w:rPr>
+        <w:t>aute</w:t>
+      </w:r>
+      <w:proofErr w:type="spellEnd"/>
+      <w:r>
+        <w:rPr>
+          <w:lang w:val="en-US"/>
+        </w:rPr>
+        <w:t xml:space="preserve"> </w:t>
+      </w:r>
+      <w:proofErr w:type="spellStart"/>
+      <w:r>
+        <w:rPr>
+          <w:lang w:val="en-US"/>
+        </w:rPr>
+        <w:t>irure</w:t>
+      </w:r>
+      <w:proofErr w:type="spellEnd"/>
+      <w:r>
+        <w:rPr>
+          <w:lang w:val="en-US"/>
+        </w:rPr>
+        <w:t xml:space="preserve"> dolor in </w:t>
+      </w:r>
+      <w:proofErr w:type="spellStart"/>
+      <w:r>
+        <w:rPr>
+          <w:lang w:val="en-US"/>
+        </w:rPr>
+        <w:t>reprehenderit</w:t>
+      </w:r>
+      <w:proofErr w:type="spellEnd"/>
+      <w:r>
+        <w:rPr>
+          <w:lang w:val="en-US"/>
+        </w:rPr>
+        <w:t xml:space="preserve"> in </w:t>
+      </w:r>
+      <w:proofErr w:type="spellStart"/>
+      <w:r>
+        <w:rPr>
+          <w:lang w:val="en-US"/>
+        </w:rPr>
+        <w:t>voluptate</w:t>
+      </w:r>
+      <w:proofErr w:type="spellEnd"/>
+      <w:r>
+        <w:rPr>
+          <w:lang w:val="en-US"/>
+        </w:rPr>
+        <w:t xml:space="preserve"> </w:t>
+      </w:r>
+      <w:proofErr w:type="spellStart"/>
+      <w:r>
+        <w:rPr>
+          <w:lang w:val="en-US"/>
+        </w:rPr>
+        <w:t>velit</w:t>
+      </w:r>
+      <w:proofErr w:type="spellEnd"/>
+      <w:r>
+        <w:rPr>
+          <w:lang w:val="en-US"/>
+        </w:rPr>
+        <w:t xml:space="preserve"> </w:t>
+      </w:r>
+      <w:proofErr w:type="spellStart"/>
+      <w:r>
+        <w:rPr>
+          <w:lang w:val="en-US"/>
+        </w:rPr>
+        <w:t>esse</w:t>
+      </w:r>
+      <w:proofErr w:type="spellEnd"/>
+      <w:r>
+        <w:rPr>
+          <w:lang w:val="en-US"/>
+        </w:rPr>
+        <w:t xml:space="preserve"> </w:t>
+      </w:r>
+      <w:proofErr w:type="spellStart"/>
+      <w:r>
+        <w:rPr>
+          <w:lang w:val="en-US"/>
+        </w:rPr>
+        <w:t>cillum</w:t>
+      </w:r>
+      <w:proofErr w:type="spellEnd"/>
+      <w:r>
+        <w:rPr>
+          <w:lang w:val="en-US"/>
+        </w:rPr>
+        <w:t xml:space="preserve"> dolore </w:t>
+      </w:r>
+      <w:proofErr w:type="spellStart"/>
+      <w:r>
+        <w:rPr>
+          <w:lang w:val="en-US"/>
+        </w:rPr>
+        <w:t>eu</w:t>
+      </w:r>
+      <w:proofErr w:type="spellEnd"/>
+      <w:r>
+        <w:rPr>
+          <w:lang w:val="en-US"/>
+        </w:rPr>
+        <w:t xml:space="preserve"> </w:t>
+      </w:r>
+      <w:proofErr w:type="spellStart"/>
+      <w:r>
+        <w:rPr>
+          <w:lang w:val="en-US"/>
+        </w:rPr>
+        <w:t>fugiat</w:t>
+      </w:r>
+      <w:proofErr w:type="spellEnd"/>
+      <w:r>
+        <w:rPr>
+          <w:lang w:val="en-US"/>
+        </w:rPr>
+        <w:t xml:space="preserve"> </w:t>
+      </w:r>
+      <w:proofErr w:type="spellStart"/>
+      <w:r>
+        <w:rPr>
+          <w:lang w:val="en-US"/>
+        </w:rPr>
+        <w:t>nulla</w:t>
+      </w:r>
+      <w:proofErr w:type="spellEnd"/>
+      <w:r>
+        <w:rPr>
+          <w:lang w:val="en-US"/>
+        </w:rPr>
+        <w:t xml:space="preserve"> </w:t>
+      </w:r>
+      <w:proofErr w:type="spellStart"/>
+      <w:r>
+        <w:rPr>
+          <w:lang w:val="en-US"/>
+        </w:rPr>
+        <w:t>pariatur</w:t>
+      </w:r>
+      <w:proofErr w:type="spellEnd"/>
+      <w:r>
+        <w:rPr>
+          <w:lang w:val="en-US"/>
+        </w:rPr>
+        <w:t xml:space="preserve">. </w:t>
+      </w:r>
+      <w:proofErr w:type="spellStart"/>
+      <w:r>
+        <w:rPr>
+          <w:lang w:val="en-US"/>
+        </w:rPr>
+        <w:t>Excepteur</w:t>
+      </w:r>
+      <w:proofErr w:type="spellEnd"/>
+      <w:r>
+        <w:rPr>
+          <w:lang w:val="en-US"/>
+        </w:rPr>
+        <w:t xml:space="preserve"> </w:t>
+      </w:r>
+      <w:proofErr w:type="spellStart"/>
+      <w:r>
+        <w:rPr>
+          <w:lang w:val="en-US"/>
+        </w:rPr>
+        <w:t>sint</w:t>
+      </w:r>
+      <w:proofErr w:type="spellEnd"/>
+      <w:r>
+        <w:rPr>
+          <w:lang w:val="en-US"/>
+        </w:rPr>
+        <w:t xml:space="preserve"> </w:t>
+      </w:r>
+      <w:proofErr w:type="spellStart"/>
+      <w:r>
+        <w:rPr>
+          <w:lang w:val="en-US"/>
+        </w:rPr>
+        <w:t>occaecat</w:t>
+      </w:r>
+      <w:proofErr w:type="spellEnd"/>
+      <w:r>
+        <w:rPr>
+          <w:lang w:val="en-US"/>
+        </w:rPr>
+        <w:t xml:space="preserve"> </w:t>
+      </w:r>
+      <w:proofErr w:type="spellStart"/>
+      <w:r>
+        <w:rPr>
+          <w:lang w:val="en-US"/>
+        </w:rPr>
+        <w:t>cupidatat</w:t>
+      </w:r>
+      <w:proofErr w:type="spellEnd"/>
+      <w:r>
+        <w:rPr>
+          <w:lang w:val="en-US"/>
+        </w:rPr>
+        <w:t xml:space="preserve"> non </w:t>
+      </w:r>
+      <w:proofErr w:type="spellStart"/>
+      <w:r>
+        <w:rPr>
+          <w:lang w:val="en-US"/>
+        </w:rPr>
+        <w:t>proident</w:t>
+      </w:r>
+      <w:proofErr w:type="spellEnd"/>
+      <w:r>
+        <w:rPr>
+          <w:lang w:val="en-US"/>
+        </w:rPr>
+        <w:t xml:space="preserve">, sunt in culpa qui </w:t>
+      </w:r>
+      <w:proofErr w:type="spellStart"/>
+      <w:r>
+        <w:rPr>
+          <w:lang w:val="en-US"/>
+        </w:rPr>
+        <w:t>officia</w:t>
+      </w:r>
+      <w:proofErr w:type="spellEnd"/>
+      <w:r>
+        <w:rPr>
+          <w:lang w:val="en-US"/>
+        </w:rPr>
+        <w:t xml:space="preserve"> </w:t>
+      </w:r>
+      <w:proofErr w:type="spellStart"/>
+      <w:r>
+        <w:rPr>
+          <w:lang w:val="en-US"/>
+        </w:rPr>
+        <w:t>deserunt</w:t>
+      </w:r>
+      <w:proofErr w:type="spellEnd"/>
+      <w:r>
+        <w:rPr>
+          <w:lang w:val="en-US"/>
+        </w:rPr>
+        <w:t xml:space="preserve"> </w:t>
+      </w:r>
+      <w:proofErr w:type="spellStart"/>
+      <w:r>
+        <w:rPr>
+          <w:lang w:val="en-US"/>
+        </w:rPr>
+        <w:t>mollit</w:t>
+      </w:r>
+      <w:proofErr w:type="spellEnd"/>
+      <w:r>
+        <w:rPr>
+          <w:lang w:val="en-US"/>
+        </w:rPr>
+        <w:t xml:space="preserve"> </w:t>
+      </w:r>
+      <w:proofErr w:type="spellStart"/>
+      <w:r>
+        <w:rPr>
+          <w:lang w:val="en-US"/>
+        </w:rPr>
+        <w:t>anim</w:t>
+      </w:r>
+      <w:proofErr w:type="spellEnd"/>
+      <w:r>
+        <w:rPr>
+          <w:lang w:val="en-US"/>
+        </w:rPr>
+        <w:t xml:space="preserve"> id </w:t>
+      </w:r>
+      <w:proofErr w:type="spellStart"/>
+      <w:r>
+        <w:rPr>
+          <w:lang w:val="en-US"/>
+        </w:rPr>
+        <w:t>est</w:t>
+      </w:r>
+      <w:proofErr w:type="spellEnd"/>
+      <w:r>
+        <w:rPr>
+          <w:lang w:val="en-US"/>
+        </w:rPr>
+        <w:t xml:space="preserve"> </w:t>
+      </w:r>
+      <w:proofErr w:type="spellStart"/>
+      <w:r>
+        <w:rPr>
+          <w:lang w:val="en-US"/>
+        </w:rPr>
+        <w:t>laborum</w:t>
+      </w:r>
+      <w:proofErr w:type="spellEnd"/>
+      <w:r>
+        <w:rPr>
+          <w:lang w:val="en-US"/>
+        </w:rPr>
+        <w:t>."</w:t>
       </w:r>
     </w:p>
     <w:p>
@@ -5178,7 +5534,7 @@
                     <pic:cNvPicPr preferRelativeResize="0"/>
                   </pic:nvPicPr>
                   <pic:blipFill>
-                    <a:blip r:embed="rId38"/>
+                    <a:blip r:embed="rId43"/>
                     <a:srcRect/>
                     <a:stretch>
                       <a:fillRect/>
@@ -5219,7 +5575,133 @@
         <w:rPr>
           <w:lang w:val="en-US"/>
         </w:rPr>
-        <w:t xml:space="preserve">Lorem ipsum dolor sit amet, consectetur adipiscing elit, sed do eiusmod tempor incididunt ut labore et dolore magna aliqua. </w:t>
+        <w:t xml:space="preserve">Lorem ipsum dolor sit </w:t>
+      </w:r>
+      <w:proofErr w:type="spellStart"/>
+      <w:r>
+        <w:rPr>
+          <w:lang w:val="en-US"/>
+        </w:rPr>
+        <w:t>amet</w:t>
+      </w:r>
+      <w:proofErr w:type="spellEnd"/>
+      <w:r>
+        <w:rPr>
+          <w:lang w:val="en-US"/>
+        </w:rPr>
+        <w:t xml:space="preserve">, </w:t>
+      </w:r>
+      <w:proofErr w:type="spellStart"/>
+      <w:r>
+        <w:rPr>
+          <w:lang w:val="en-US"/>
+        </w:rPr>
+        <w:t>consectetur</w:t>
+      </w:r>
+      <w:proofErr w:type="spellEnd"/>
+      <w:r>
+        <w:rPr>
+          <w:lang w:val="en-US"/>
+        </w:rPr>
+        <w:t xml:space="preserve"> </w:t>
+      </w:r>
+      <w:proofErr w:type="spellStart"/>
+      <w:r>
+        <w:rPr>
+          <w:lang w:val="en-US"/>
+        </w:rPr>
+        <w:t>adipiscing</w:t>
+      </w:r>
+      <w:proofErr w:type="spellEnd"/>
+      <w:r>
+        <w:rPr>
+          <w:lang w:val="en-US"/>
+        </w:rPr>
+        <w:t xml:space="preserve"> </w:t>
+      </w:r>
+      <w:proofErr w:type="spellStart"/>
+      <w:r>
+        <w:rPr>
+          <w:lang w:val="en-US"/>
+        </w:rPr>
+        <w:t>elit</w:t>
+      </w:r>
+      <w:proofErr w:type="spellEnd"/>
+      <w:r>
+        <w:rPr>
+          <w:lang w:val="en-US"/>
+        </w:rPr>
+        <w:t xml:space="preserve">, sed do </w:t>
+      </w:r>
+      <w:proofErr w:type="spellStart"/>
+      <w:r>
+        <w:rPr>
+          <w:lang w:val="en-US"/>
+        </w:rPr>
+        <w:t>eiusmod</w:t>
+      </w:r>
+      <w:proofErr w:type="spellEnd"/>
+      <w:r>
+        <w:rPr>
+          <w:lang w:val="en-US"/>
+        </w:rPr>
+        <w:t xml:space="preserve"> </w:t>
+      </w:r>
+      <w:proofErr w:type="spellStart"/>
+      <w:r>
+        <w:rPr>
+          <w:lang w:val="en-US"/>
+        </w:rPr>
+        <w:t>tempor</w:t>
+      </w:r>
+      <w:proofErr w:type="spellEnd"/>
+      <w:r>
+        <w:rPr>
+          <w:lang w:val="en-US"/>
+        </w:rPr>
+        <w:t xml:space="preserve"> </w:t>
+      </w:r>
+      <w:proofErr w:type="spellStart"/>
+      <w:r>
+        <w:rPr>
+          <w:lang w:val="en-US"/>
+        </w:rPr>
+        <w:t>incididunt</w:t>
+      </w:r>
+      <w:proofErr w:type="spellEnd"/>
+      <w:r>
+        <w:rPr>
+          <w:lang w:val="en-US"/>
+        </w:rPr>
+        <w:t xml:space="preserve"> </w:t>
+      </w:r>
+      <w:proofErr w:type="spellStart"/>
+      <w:r>
+        <w:rPr>
+          <w:lang w:val="en-US"/>
+        </w:rPr>
+        <w:t>ut</w:t>
+      </w:r>
+      <w:proofErr w:type="spellEnd"/>
+      <w:r>
+        <w:rPr>
+          <w:lang w:val="en-US"/>
+        </w:rPr>
+        <w:t xml:space="preserve"> labore et dolore magna </w:t>
+      </w:r>
+      <w:proofErr w:type="spellStart"/>
+      <w:r>
+        <w:rPr>
+          <w:lang w:val="en-US"/>
+        </w:rPr>
+        <w:t>aliqua</w:t>
+      </w:r>
+      <w:proofErr w:type="spellEnd"/>
+      <w:r>
+        <w:rPr>
+          <w:lang w:val="en-US"/>
+        </w:rPr>
+        <w:t xml:space="preserve">. </w:t>
       </w:r>
       <w:r>
         <w:rPr>
@@ -5231,7 +5713,315 @@
         <w:rPr>
           <w:lang w:val="en-US"/>
         </w:rPr>
-        <w:t>Duis aute irure dolor in reprehenderit in voluptate velit esse cillum dolore eu fugiat nulla pariatur. Excepteur sint occaecat cupidatat non proident, sunt in culpa qui officia deserunt mollit anim id est laborum.</w:t>
+        <w:t xml:space="preserve">Duis </w:t>
+      </w:r>
+      <w:proofErr w:type="spellStart"/>
+      <w:r>
+        <w:rPr>
+          <w:lang w:val="en-US"/>
+        </w:rPr>
+        <w:t>aute</w:t>
+      </w:r>
+      <w:proofErr w:type="spellEnd"/>
+      <w:r>
+        <w:rPr>
+          <w:lang w:val="en-US"/>
+        </w:rPr>
+        <w:t xml:space="preserve"> </w:t>
+      </w:r>
+      <w:proofErr w:type="spellStart"/>
+      <w:r>
+        <w:rPr>
+          <w:lang w:val="en-US"/>
+        </w:rPr>
+        <w:t>irure</w:t>
+      </w:r>
+      <w:proofErr w:type="spellEnd"/>
+      <w:r>
+        <w:rPr>
+          <w:lang w:val="en-US"/>
+        </w:rPr>
+        <w:t xml:space="preserve"> dolor in </w:t>
+      </w:r>
+      <w:proofErr w:type="spellStart"/>
+      <w:r>
+        <w:rPr>
+          <w:lang w:val="en-US"/>
+        </w:rPr>
+        <w:t>reprehenderit</w:t>
+      </w:r>
+      <w:proofErr w:type="spellEnd"/>
+      <w:r>
+        <w:rPr>
+          <w:lang w:val="en-US"/>
+        </w:rPr>
+        <w:t xml:space="preserve"> in </w:t>
+      </w:r>
+      <w:proofErr w:type="spellStart"/>
+      <w:r>
+        <w:rPr>
+          <w:lang w:val="en-US"/>
+        </w:rPr>
+        <w:t>voluptate</w:t>
+      </w:r>
+      <w:proofErr w:type="spellEnd"/>
+      <w:r>
+        <w:rPr>
+          <w:lang w:val="en-US"/>
+        </w:rPr>
+        <w:t xml:space="preserve"> </w:t>
+      </w:r>
+      <w:proofErr w:type="spellStart"/>
+      <w:r>
+        <w:rPr>
+          <w:lang w:val="en-US"/>
+        </w:rPr>
+        <w:t>velit</w:t>
+      </w:r>
+      <w:proofErr w:type="spellEnd"/>
+      <w:r>
+        <w:rPr>
+          <w:lang w:val="en-US"/>
+        </w:rPr>
+        <w:t xml:space="preserve"> </w:t>
+      </w:r>
+      <w:proofErr w:type="spellStart"/>
+      <w:r>
+        <w:rPr>
+          <w:lang w:val="en-US"/>
+        </w:rPr>
+        <w:t>esse</w:t>
+      </w:r>
+      <w:proofErr w:type="spellEnd"/>
+      <w:r>
+        <w:rPr>
+          <w:lang w:val="en-US"/>
+        </w:rPr>
+        <w:t xml:space="preserve"> </w:t>
+      </w:r>
+      <w:proofErr w:type="spellStart"/>
+      <w:r>
+        <w:rPr>
+          <w:lang w:val="en-US"/>
+        </w:rPr>
+        <w:t>cillum</w:t>
+      </w:r>
+      <w:proofErr w:type="spellEnd"/>
+      <w:r>
+        <w:rPr>
+          <w:lang w:val="en-US"/>
+        </w:rPr>
+        <w:t xml:space="preserve"> dolore </w:t>
+      </w:r>
+      <w:proofErr w:type="spellStart"/>
+      <w:r>
+        <w:rPr>
+          <w:lang w:val="en-US"/>
+        </w:rPr>
+        <w:t>eu</w:t>
+      </w:r>
+      <w:proofErr w:type="spellEnd"/>
+      <w:r>
+        <w:rPr>
+          <w:lang w:val="en-US"/>
+        </w:rPr>
+        <w:t xml:space="preserve"> </w:t>
+      </w:r>
+      <w:proofErr w:type="spellStart"/>
+      <w:r>
+        <w:rPr>
+          <w:lang w:val="en-US"/>
+        </w:rPr>
+        <w:t>fugiat</w:t>
+      </w:r>
+      <w:proofErr w:type="spellEnd"/>
+      <w:r>
+        <w:rPr>
+          <w:lang w:val="en-US"/>
+        </w:rPr>
+        <w:t xml:space="preserve"> </w:t>
+      </w:r>
+      <w:proofErr w:type="spellStart"/>
+      <w:r>
+        <w:rPr>
+          <w:lang w:val="en-US"/>
+        </w:rPr>
+        <w:t>nulla</w:t>
+      </w:r>
+      <w:proofErr w:type="spellEnd"/>
+      <w:r>
+        <w:rPr>
+          <w:lang w:val="en-US"/>
+        </w:rPr>
+        <w:t xml:space="preserve"> </w:t>
+      </w:r>
+      <w:proofErr w:type="spellStart"/>
+      <w:r>
+        <w:rPr>
+          <w:lang w:val="en-US"/>
+        </w:rPr>
+        <w:t>pariatur</w:t>
+      </w:r>
+      <w:proofErr w:type="spellEnd"/>
+      <w:r>
+        <w:rPr>
+          <w:lang w:val="en-US"/>
+        </w:rPr>
+        <w:t xml:space="preserve">. </w:t>
+      </w:r>
+      <w:proofErr w:type="spellStart"/>
+      <w:r>
+        <w:rPr>
+          <w:lang w:val="en-US"/>
+        </w:rPr>
+        <w:t>Excepteur</w:t>
+      </w:r>
+      <w:proofErr w:type="spellEnd"/>
+      <w:r>
+        <w:rPr>
+          <w:lang w:val="en-US"/>
+        </w:rPr>
+        <w:t xml:space="preserve"> </w:t>
+      </w:r>
+      <w:proofErr w:type="spellStart"/>
+      <w:r>
+        <w:rPr>
+          <w:lang w:val="en-US"/>
+        </w:rPr>
+        <w:t>sint</w:t>
+      </w:r>
+      <w:proofErr w:type="spellEnd"/>
+      <w:r>
+        <w:rPr>
+          <w:lang w:val="en-US"/>
+        </w:rPr>
+        <w:t xml:space="preserve"> </w:t>
+      </w:r>
+      <w:proofErr w:type="spellStart"/>
+      <w:r>
+        <w:rPr>
+          <w:lang w:val="en-US"/>
+        </w:rPr>
+        <w:t>occaecat</w:t>
+      </w:r>
+      <w:proofErr w:type="spellEnd"/>
+      <w:r>
+        <w:rPr>
+          <w:lang w:val="en-US"/>
+        </w:rPr>
+        <w:t xml:space="preserve"> </w:t>
+      </w:r>
+      <w:proofErr w:type="spellStart"/>
+      <w:r>
+        <w:rPr>
+          <w:lang w:val="en-US"/>
+        </w:rPr>
+        <w:t>cupidatat</w:t>
+      </w:r>
+      <w:proofErr w:type="spellEnd"/>
+      <w:r>
+        <w:rPr>
+          <w:lang w:val="en-US"/>
+        </w:rPr>
+        <w:t xml:space="preserve"> non </w:t>
+      </w:r>
+      <w:proofErr w:type="spellStart"/>
+      <w:r>
+        <w:rPr>
+          <w:lang w:val="en-US"/>
+        </w:rPr>
+        <w:t>proident</w:t>
+      </w:r>
+      <w:proofErr w:type="spellEnd"/>
+      <w:r>
+        <w:rPr>
+          <w:lang w:val="en-US"/>
+        </w:rPr>
+        <w:t xml:space="preserve">, sunt in culpa qui </w:t>
+      </w:r>
+      <w:proofErr w:type="spellStart"/>
+      <w:r>
+        <w:rPr>
+          <w:lang w:val="en-US"/>
+        </w:rPr>
+        <w:t>officia</w:t>
+      </w:r>
+      <w:proofErr w:type="spellEnd"/>
+      <w:r>
+        <w:rPr>
+          <w:lang w:val="en-US"/>
+        </w:rPr>
+        <w:t xml:space="preserve"> </w:t>
+      </w:r>
+      <w:proofErr w:type="spellStart"/>
+      <w:r>
+        <w:rPr>
+          <w:lang w:val="en-US"/>
+        </w:rPr>
+        <w:t>deserunt</w:t>
+      </w:r>
+      <w:proofErr w:type="spellEnd"/>
+      <w:r>
+        <w:rPr>
+          <w:lang w:val="en-US"/>
+        </w:rPr>
+        <w:t xml:space="preserve"> </w:t>
+      </w:r>
+      <w:proofErr w:type="spellStart"/>
+      <w:r>
+        <w:rPr>
+          <w:lang w:val="en-US"/>
+        </w:rPr>
+        <w:t>mollit</w:t>
+      </w:r>
+      <w:proofErr w:type="spellEnd"/>
+      <w:r>
+        <w:rPr>
+          <w:lang w:val="en-US"/>
+        </w:rPr>
+        <w:t xml:space="preserve"> </w:t>
+      </w:r>
+      <w:proofErr w:type="spellStart"/>
+      <w:r>
+        <w:rPr>
+          <w:lang w:val="en-US"/>
+        </w:rPr>
+        <w:t>anim</w:t>
+      </w:r>
+      <w:proofErr w:type="spellEnd"/>
+      <w:r>
+        <w:rPr>
+          <w:lang w:val="en-US"/>
+        </w:rPr>
+        <w:t xml:space="preserve"> id </w:t>
+      </w:r>
+      <w:proofErr w:type="spellStart"/>
+      <w:r>
+        <w:rPr>
+          <w:lang w:val="en-US"/>
+        </w:rPr>
+        <w:t>est</w:t>
+      </w:r>
+      <w:proofErr w:type="spellEnd"/>
+      <w:r>
+        <w:rPr>
+          <w:lang w:val="en-US"/>
+        </w:rPr>
+        <w:t xml:space="preserve"> </w:t>
+      </w:r>
+      <w:proofErr w:type="spellStart"/>
+      <w:r>
+        <w:rPr>
+          <w:lang w:val="en-US"/>
+        </w:rPr>
+        <w:t>laborum</w:t>
+      </w:r>
+      <w:proofErr w:type="spellEnd"/>
+      <w:r>
+        <w:rPr>
+          <w:lang w:val="en-US"/>
+        </w:rPr>
+        <w:t>.</w:t>
       </w:r>
     </w:p>
     <w:p>
@@ -5290,7 +6080,7 @@
                     <pic:cNvPicPr preferRelativeResize="0"/>
                   </pic:nvPicPr>
                   <pic:blipFill>
-                    <a:blip r:embed="rId38"/>
+                    <a:blip r:embed="rId43"/>
                     <a:srcRect/>
                     <a:stretch>
                       <a:fillRect/>
@@ -5336,7 +6126,133 @@
         <w:rPr>
           <w:lang w:val="en-US"/>
         </w:rPr>
-        <w:t xml:space="preserve">Lorem ipsum dolor sit amet, consectetur adipiscing elit, sed do eiusmod tempor incididunt ut labore et dolore magna aliqua. </w:t>
+        <w:t xml:space="preserve">Lorem ipsum dolor sit </w:t>
+      </w:r>
+      <w:proofErr w:type="spellStart"/>
+      <w:r>
+        <w:rPr>
+          <w:lang w:val="en-US"/>
+        </w:rPr>
+        <w:t>amet</w:t>
+      </w:r>
+      <w:proofErr w:type="spellEnd"/>
+      <w:r>
+        <w:rPr>
+          <w:lang w:val="en-US"/>
+        </w:rPr>
+        <w:t xml:space="preserve">, </w:t>
+      </w:r>
+      <w:proofErr w:type="spellStart"/>
+      <w:r>
+        <w:rPr>
+          <w:lang w:val="en-US"/>
+        </w:rPr>
+        <w:t>consectetur</w:t>
+      </w:r>
+      <w:proofErr w:type="spellEnd"/>
+      <w:r>
+        <w:rPr>
+          <w:lang w:val="en-US"/>
+        </w:rPr>
+        <w:t xml:space="preserve"> </w:t>
+      </w:r>
+      <w:proofErr w:type="spellStart"/>
+      <w:r>
+        <w:rPr>
+          <w:lang w:val="en-US"/>
+        </w:rPr>
+        <w:t>adipiscing</w:t>
+      </w:r>
+      <w:proofErr w:type="spellEnd"/>
+      <w:r>
+        <w:rPr>
+          <w:lang w:val="en-US"/>
+        </w:rPr>
+        <w:t xml:space="preserve"> </w:t>
+      </w:r>
+      <w:proofErr w:type="spellStart"/>
+      <w:r>
+        <w:rPr>
+          <w:lang w:val="en-US"/>
+        </w:rPr>
+        <w:t>elit</w:t>
+      </w:r>
+      <w:proofErr w:type="spellEnd"/>
+      <w:r>
+        <w:rPr>
+          <w:lang w:val="en-US"/>
+        </w:rPr>
+        <w:t xml:space="preserve">, sed do </w:t>
+      </w:r>
+      <w:proofErr w:type="spellStart"/>
+      <w:r>
+        <w:rPr>
+          <w:lang w:val="en-US"/>
+        </w:rPr>
+        <w:t>eiusmod</w:t>
+      </w:r>
+      <w:proofErr w:type="spellEnd"/>
+      <w:r>
+        <w:rPr>
+          <w:lang w:val="en-US"/>
+        </w:rPr>
+        <w:t xml:space="preserve"> </w:t>
+      </w:r>
+      <w:proofErr w:type="spellStart"/>
+      <w:r>
+        <w:rPr>
+          <w:lang w:val="en-US"/>
+        </w:rPr>
+        <w:t>tempor</w:t>
+      </w:r>
+      <w:proofErr w:type="spellEnd"/>
+      <w:r>
+        <w:rPr>
+          <w:lang w:val="en-US"/>
+        </w:rPr>
+        <w:t xml:space="preserve"> </w:t>
+      </w:r>
+      <w:proofErr w:type="spellStart"/>
+      <w:r>
+        <w:rPr>
+          <w:lang w:val="en-US"/>
+        </w:rPr>
+        <w:t>incididunt</w:t>
+      </w:r>
+      <w:proofErr w:type="spellEnd"/>
+      <w:r>
+        <w:rPr>
+          <w:lang w:val="en-US"/>
+        </w:rPr>
+        <w:t xml:space="preserve"> </w:t>
+      </w:r>
+      <w:proofErr w:type="spellStart"/>
+      <w:r>
+        <w:rPr>
+          <w:lang w:val="en-US"/>
+        </w:rPr>
+        <w:t>ut</w:t>
+      </w:r>
+      <w:proofErr w:type="spellEnd"/>
+      <w:r>
+        <w:rPr>
+          <w:lang w:val="en-US"/>
+        </w:rPr>
+        <w:t xml:space="preserve"> labore et dolore magna </w:t>
+      </w:r>
+      <w:proofErr w:type="spellStart"/>
+      <w:r>
+        <w:rPr>
+          <w:lang w:val="en-US"/>
+        </w:rPr>
+        <w:t>aliqua</w:t>
+      </w:r>
+      <w:proofErr w:type="spellEnd"/>
+      <w:r>
+        <w:rPr>
+          <w:lang w:val="en-US"/>
+        </w:rPr>
+        <w:t xml:space="preserve">. </w:t>
       </w:r>
       <w:r>
         <w:rPr>
@@ -5348,7 +6264,315 @@
         <w:rPr>
           <w:lang w:val="en-US"/>
         </w:rPr>
-        <w:t>Duis aute irure dolor in reprehenderit in voluptate velit esse cillum dolore eu fugiat nulla pariatur. Excepteur sint occaecat cupidatat non proident, sunt in culpa qui officia deserunt mollit anim id est laborum.</w:t>
+        <w:t xml:space="preserve">Duis </w:t>
+      </w:r>
+      <w:proofErr w:type="spellStart"/>
+      <w:r>
+        <w:rPr>
+          <w:lang w:val="en-US"/>
+        </w:rPr>
+        <w:t>aute</w:t>
+      </w:r>
+      <w:proofErr w:type="spellEnd"/>
+      <w:r>
+        <w:rPr>
+          <w:lang w:val="en-US"/>
+        </w:rPr>
+        <w:t xml:space="preserve"> </w:t>
+      </w:r>
+      <w:proofErr w:type="spellStart"/>
+      <w:r>
+        <w:rPr>
+          <w:lang w:val="en-US"/>
+        </w:rPr>
+        <w:t>irure</w:t>
+      </w:r>
+      <w:proofErr w:type="spellEnd"/>
+      <w:r>
+        <w:rPr>
+          <w:lang w:val="en-US"/>
+        </w:rPr>
+        <w:t xml:space="preserve"> dolor in </w:t>
+      </w:r>
+      <w:proofErr w:type="spellStart"/>
+      <w:r>
+        <w:rPr>
+          <w:lang w:val="en-US"/>
+        </w:rPr>
+        <w:t>reprehenderit</w:t>
+      </w:r>
+      <w:proofErr w:type="spellEnd"/>
+      <w:r>
+        <w:rPr>
+          <w:lang w:val="en-US"/>
+        </w:rPr>
+        <w:t xml:space="preserve"> in </w:t>
+      </w:r>
+      <w:proofErr w:type="spellStart"/>
+      <w:r>
+        <w:rPr>
+          <w:lang w:val="en-US"/>
+        </w:rPr>
+        <w:t>voluptate</w:t>
+      </w:r>
+      <w:proofErr w:type="spellEnd"/>
+      <w:r>
+        <w:rPr>
+          <w:lang w:val="en-US"/>
+        </w:rPr>
+        <w:t xml:space="preserve"> </w:t>
+      </w:r>
+      <w:proofErr w:type="spellStart"/>
+      <w:r>
+        <w:rPr>
+          <w:lang w:val="en-US"/>
+        </w:rPr>
+        <w:t>velit</w:t>
+      </w:r>
+      <w:proofErr w:type="spellEnd"/>
+      <w:r>
+        <w:rPr>
+          <w:lang w:val="en-US"/>
+        </w:rPr>
+        <w:t xml:space="preserve"> </w:t>
+      </w:r>
+      <w:proofErr w:type="spellStart"/>
+      <w:r>
+        <w:rPr>
+          <w:lang w:val="en-US"/>
+        </w:rPr>
+        <w:t>esse</w:t>
+      </w:r>
+      <w:proofErr w:type="spellEnd"/>
+      <w:r>
+        <w:rPr>
+          <w:lang w:val="en-US"/>
+        </w:rPr>
+        <w:t xml:space="preserve"> </w:t>
+      </w:r>
+      <w:proofErr w:type="spellStart"/>
+      <w:r>
+        <w:rPr>
+          <w:lang w:val="en-US"/>
+        </w:rPr>
+        <w:t>cillum</w:t>
+      </w:r>
+      <w:proofErr w:type="spellEnd"/>
+      <w:r>
+        <w:rPr>
+          <w:lang w:val="en-US"/>
+        </w:rPr>
+        <w:t xml:space="preserve"> dolore </w:t>
+      </w:r>
+      <w:proofErr w:type="spellStart"/>
+      <w:r>
+        <w:rPr>
+          <w:lang w:val="en-US"/>
+        </w:rPr>
+        <w:t>eu</w:t>
+      </w:r>
+      <w:proofErr w:type="spellEnd"/>
+      <w:r>
+        <w:rPr>
+          <w:lang w:val="en-US"/>
+        </w:rPr>
+        <w:t xml:space="preserve"> </w:t>
+      </w:r>
+      <w:proofErr w:type="spellStart"/>
+      <w:r>
+        <w:rPr>
+          <w:lang w:val="en-US"/>
+        </w:rPr>
+        <w:t>fugiat</w:t>
+      </w:r>
+      <w:proofErr w:type="spellEnd"/>
+      <w:r>
+        <w:rPr>
+          <w:lang w:val="en-US"/>
+        </w:rPr>
+        <w:t xml:space="preserve"> </w:t>
+      </w:r>
+      <w:proofErr w:type="spellStart"/>
+      <w:r>
+        <w:rPr>
+          <w:lang w:val="en-US"/>
+        </w:rPr>
+        <w:t>nulla</w:t>
+      </w:r>
+      <w:proofErr w:type="spellEnd"/>
+      <w:r>
+        <w:rPr>
+          <w:lang w:val="en-US"/>
+        </w:rPr>
+        <w:t xml:space="preserve"> </w:t>
+      </w:r>
+      <w:proofErr w:type="spellStart"/>
+      <w:r>
+        <w:rPr>
+          <w:lang w:val="en-US"/>
+        </w:rPr>
+        <w:t>pariatur</w:t>
+      </w:r>
+      <w:proofErr w:type="spellEnd"/>
+      <w:r>
+        <w:rPr>
+          <w:lang w:val="en-US"/>
+        </w:rPr>
+        <w:t xml:space="preserve">. </w:t>
+      </w:r>
+      <w:proofErr w:type="spellStart"/>
+      <w:r>
+        <w:rPr>
+          <w:lang w:val="en-US"/>
+        </w:rPr>
+        <w:t>Excepteur</w:t>
+      </w:r>
+      <w:proofErr w:type="spellEnd"/>
+      <w:r>
+        <w:rPr>
+          <w:lang w:val="en-US"/>
+        </w:rPr>
+        <w:t xml:space="preserve"> </w:t>
+      </w:r>
+      <w:proofErr w:type="spellStart"/>
+      <w:r>
+        <w:rPr>
+          <w:lang w:val="en-US"/>
+        </w:rPr>
+        <w:t>sint</w:t>
+      </w:r>
+      <w:proofErr w:type="spellEnd"/>
+      <w:r>
+        <w:rPr>
+          <w:lang w:val="en-US"/>
+        </w:rPr>
+        <w:t xml:space="preserve"> </w:t>
+      </w:r>
+      <w:proofErr w:type="spellStart"/>
+      <w:r>
+        <w:rPr>
+          <w:lang w:val="en-US"/>
+        </w:rPr>
+        <w:t>occaecat</w:t>
+      </w:r>
+      <w:proofErr w:type="spellEnd"/>
+      <w:r>
+        <w:rPr>
+          <w:lang w:val="en-US"/>
+        </w:rPr>
+        <w:t xml:space="preserve"> </w:t>
+      </w:r>
+      <w:proofErr w:type="spellStart"/>
+      <w:r>
+        <w:rPr>
+          <w:lang w:val="en-US"/>
+        </w:rPr>
+        <w:t>cupidatat</w:t>
+      </w:r>
+      <w:proofErr w:type="spellEnd"/>
+      <w:r>
+        <w:rPr>
+          <w:lang w:val="en-US"/>
+        </w:rPr>
+        <w:t xml:space="preserve"> non </w:t>
+      </w:r>
+      <w:proofErr w:type="spellStart"/>
+      <w:r>
+        <w:rPr>
+          <w:lang w:val="en-US"/>
+        </w:rPr>
+        <w:t>proident</w:t>
+      </w:r>
+      <w:proofErr w:type="spellEnd"/>
+      <w:r>
+        <w:rPr>
+          <w:lang w:val="en-US"/>
+        </w:rPr>
+        <w:t xml:space="preserve">, sunt in culpa qui </w:t>
+      </w:r>
+      <w:proofErr w:type="spellStart"/>
+      <w:r>
+        <w:rPr>
+          <w:lang w:val="en-US"/>
+        </w:rPr>
+        <w:t>officia</w:t>
+      </w:r>
+      <w:proofErr w:type="spellEnd"/>
+      <w:r>
+        <w:rPr>
+          <w:lang w:val="en-US"/>
+        </w:rPr>
+        <w:t xml:space="preserve"> </w:t>
+      </w:r>
+      <w:proofErr w:type="spellStart"/>
+      <w:r>
+        <w:rPr>
+          <w:lang w:val="en-US"/>
+        </w:rPr>
+        <w:t>deserunt</w:t>
+      </w:r>
+      <w:proofErr w:type="spellEnd"/>
+      <w:r>
+        <w:rPr>
+          <w:lang w:val="en-US"/>
+        </w:rPr>
+        <w:t xml:space="preserve"> </w:t>
+      </w:r>
+      <w:proofErr w:type="spellStart"/>
+      <w:r>
+        <w:rPr>
+          <w:lang w:val="en-US"/>
+        </w:rPr>
+        <w:t>mollit</w:t>
+      </w:r>
+      <w:proofErr w:type="spellEnd"/>
+      <w:r>
+        <w:rPr>
+          <w:lang w:val="en-US"/>
+        </w:rPr>
+        <w:t xml:space="preserve"> </w:t>
+      </w:r>
+      <w:proofErr w:type="spellStart"/>
+      <w:r>
+        <w:rPr>
+          <w:lang w:val="en-US"/>
+        </w:rPr>
+        <w:t>anim</w:t>
+      </w:r>
+      <w:proofErr w:type="spellEnd"/>
+      <w:r>
+        <w:rPr>
+          <w:lang w:val="en-US"/>
+        </w:rPr>
+        <w:t xml:space="preserve"> id </w:t>
+      </w:r>
+      <w:proofErr w:type="spellStart"/>
+      <w:r>
+        <w:rPr>
+          <w:lang w:val="en-US"/>
+        </w:rPr>
+        <w:t>est</w:t>
+      </w:r>
+      <w:proofErr w:type="spellEnd"/>
+      <w:r>
+        <w:rPr>
+          <w:lang w:val="en-US"/>
+        </w:rPr>
+        <w:t xml:space="preserve"> </w:t>
+      </w:r>
+      <w:proofErr w:type="spellStart"/>
+      <w:r>
+        <w:rPr>
+          <w:lang w:val="en-US"/>
+        </w:rPr>
+        <w:t>laborum</w:t>
+      </w:r>
+      <w:proofErr w:type="spellEnd"/>
+      <w:r>
+        <w:rPr>
+          <w:lang w:val="en-US"/>
+        </w:rPr>
+        <w:t>.</w:t>
       </w:r>
     </w:p>
     <w:p/>
@@ -5384,7 +6608,7 @@
                     <pic:cNvPicPr preferRelativeResize="0"/>
                   </pic:nvPicPr>
                   <pic:blipFill>
-                    <a:blip r:embed="rId38"/>
+                    <a:blip r:embed="rId43"/>
                     <a:srcRect/>
                     <a:stretch>
                       <a:fillRect/>
@@ -5425,7 +6649,595 @@
         <w:rPr>
           <w:lang w:val="en-US"/>
         </w:rPr>
-        <w:t>Lorem ipsum dolor sit amet, consectetur adipiscing elit, sed do eiusmod tempor incididunt ut labore et dolore magna aliqua. Ut enim ad minim veniam, quis nostrud exercitation ullamco laboris nisi ut aliquip ex ea commodo consequat. Duis aute irure dolor in reprehenderit in voluptate velit esse cillum dolore eu fugiat nulla pariatur. Excepteur sint occaecat cupidatat non proident, sunt in culpa qui officia deserunt mollit anim id est laborum.</w:t>
+        <w:t xml:space="preserve">Lorem ipsum dolor sit </w:t>
+      </w:r>
+      <w:proofErr w:type="spellStart"/>
+      <w:r>
+        <w:rPr>
+          <w:lang w:val="en-US"/>
+        </w:rPr>
+        <w:t>amet</w:t>
+      </w:r>
+      <w:proofErr w:type="spellEnd"/>
+      <w:r>
+        <w:rPr>
+          <w:lang w:val="en-US"/>
+        </w:rPr>
+        <w:t xml:space="preserve">, </w:t>
+      </w:r>
+      <w:proofErr w:type="spellStart"/>
+      <w:r>
+        <w:rPr>
+          <w:lang w:val="en-US"/>
+        </w:rPr>
+        <w:t>consectetur</w:t>
+      </w:r>
+      <w:proofErr w:type="spellEnd"/>
+      <w:r>
+        <w:rPr>
+          <w:lang w:val="en-US"/>
+        </w:rPr>
+        <w:t xml:space="preserve"> </w:t>
+      </w:r>
+      <w:proofErr w:type="spellStart"/>
+      <w:r>
+        <w:rPr>
+          <w:lang w:val="en-US"/>
+        </w:rPr>
+        <w:t>adipiscing</w:t>
+      </w:r>
+      <w:proofErr w:type="spellEnd"/>
+      <w:r>
+        <w:rPr>
+          <w:lang w:val="en-US"/>
+        </w:rPr>
+        <w:t xml:space="preserve"> </w:t>
+      </w:r>
+      <w:proofErr w:type="spellStart"/>
+      <w:r>
+        <w:rPr>
+          <w:lang w:val="en-US"/>
+        </w:rPr>
+        <w:t>elit</w:t>
+      </w:r>
+      <w:proofErr w:type="spellEnd"/>
+      <w:r>
+        <w:rPr>
+          <w:lang w:val="en-US"/>
+        </w:rPr>
+        <w:t xml:space="preserve">, sed do </w:t>
+      </w:r>
+      <w:proofErr w:type="spellStart"/>
+      <w:r>
+        <w:rPr>
+          <w:lang w:val="en-US"/>
+        </w:rPr>
+        <w:t>eiusmod</w:t>
+      </w:r>
+      <w:proofErr w:type="spellEnd"/>
+      <w:r>
+        <w:rPr>
+          <w:lang w:val="en-US"/>
+        </w:rPr>
+        <w:t xml:space="preserve"> </w:t>
+      </w:r>
+      <w:proofErr w:type="spellStart"/>
+      <w:r>
+        <w:rPr>
+          <w:lang w:val="en-US"/>
+        </w:rPr>
+        <w:t>tempor</w:t>
+      </w:r>
+      <w:proofErr w:type="spellEnd"/>
+      <w:r>
+        <w:rPr>
+          <w:lang w:val="en-US"/>
+        </w:rPr>
+        <w:t xml:space="preserve"> </w:t>
+      </w:r>
+      <w:proofErr w:type="spellStart"/>
+      <w:r>
+        <w:rPr>
+          <w:lang w:val="en-US"/>
+        </w:rPr>
+        <w:t>incididunt</w:t>
+      </w:r>
+      <w:proofErr w:type="spellEnd"/>
+      <w:r>
+        <w:rPr>
+          <w:lang w:val="en-US"/>
+        </w:rPr>
+        <w:t xml:space="preserve"> </w:t>
+      </w:r>
+      <w:proofErr w:type="spellStart"/>
+      <w:r>
+        <w:rPr>
+          <w:lang w:val="en-US"/>
+        </w:rPr>
+        <w:t>ut</w:t>
+      </w:r>
+      <w:proofErr w:type="spellEnd"/>
+      <w:r>
+        <w:rPr>
+          <w:lang w:val="en-US"/>
+        </w:rPr>
+        <w:t xml:space="preserve"> labore et dolore magna </w:t>
+      </w:r>
+      <w:proofErr w:type="spellStart"/>
+      <w:r>
+        <w:rPr>
+          <w:lang w:val="en-US"/>
+        </w:rPr>
+        <w:t>aliqua</w:t>
+      </w:r>
+      <w:proofErr w:type="spellEnd"/>
+      <w:r>
+        <w:rPr>
+          <w:lang w:val="en-US"/>
+        </w:rPr>
+        <w:t xml:space="preserve">. Ut </w:t>
+      </w:r>
+      <w:proofErr w:type="spellStart"/>
+      <w:r>
+        <w:rPr>
+          <w:lang w:val="en-US"/>
+        </w:rPr>
+        <w:t>enim</w:t>
+      </w:r>
+      <w:proofErr w:type="spellEnd"/>
+      <w:r>
+        <w:rPr>
+          <w:lang w:val="en-US"/>
+        </w:rPr>
+        <w:t xml:space="preserve"> ad minim </w:t>
+      </w:r>
+      <w:proofErr w:type="spellStart"/>
+      <w:r>
+        <w:rPr>
+          <w:lang w:val="en-US"/>
+        </w:rPr>
+        <w:t>veniam</w:t>
+      </w:r>
+      <w:proofErr w:type="spellEnd"/>
+      <w:r>
+        <w:rPr>
+          <w:lang w:val="en-US"/>
+        </w:rPr>
+        <w:t xml:space="preserve">, </w:t>
+      </w:r>
+      <w:proofErr w:type="spellStart"/>
+      <w:r>
+        <w:rPr>
+          <w:lang w:val="en-US"/>
+        </w:rPr>
+        <w:t>quis</w:t>
+      </w:r>
+      <w:proofErr w:type="spellEnd"/>
+      <w:r>
+        <w:rPr>
+          <w:lang w:val="en-US"/>
+        </w:rPr>
+        <w:t xml:space="preserve"> </w:t>
+      </w:r>
+      <w:proofErr w:type="spellStart"/>
+      <w:r>
+        <w:rPr>
+          <w:lang w:val="en-US"/>
+        </w:rPr>
+        <w:t>nostrud</w:t>
+      </w:r>
+      <w:proofErr w:type="spellEnd"/>
+      <w:r>
+        <w:rPr>
+          <w:lang w:val="en-US"/>
+        </w:rPr>
+        <w:t xml:space="preserve"> exercitation </w:t>
+      </w:r>
+      <w:proofErr w:type="spellStart"/>
+      <w:r>
+        <w:rPr>
+          <w:lang w:val="en-US"/>
+        </w:rPr>
+        <w:t>ullamco</w:t>
+      </w:r>
+      <w:proofErr w:type="spellEnd"/>
+      <w:r>
+        <w:rPr>
+          <w:lang w:val="en-US"/>
+        </w:rPr>
+        <w:t xml:space="preserve"> </w:t>
+      </w:r>
+      <w:proofErr w:type="spellStart"/>
+      <w:r>
+        <w:rPr>
+          <w:lang w:val="en-US"/>
+        </w:rPr>
+        <w:t>laboris</w:t>
+      </w:r>
+      <w:proofErr w:type="spellEnd"/>
+      <w:r>
+        <w:rPr>
+          <w:lang w:val="en-US"/>
+        </w:rPr>
+        <w:t xml:space="preserve"> nisi </w:t>
+      </w:r>
+      <w:proofErr w:type="spellStart"/>
+      <w:r>
+        <w:rPr>
+          <w:lang w:val="en-US"/>
+        </w:rPr>
+        <w:t>ut</w:t>
+      </w:r>
+      <w:proofErr w:type="spellEnd"/>
+      <w:r>
+        <w:rPr>
+          <w:lang w:val="en-US"/>
+        </w:rPr>
+        <w:t xml:space="preserve"> </w:t>
+      </w:r>
+      <w:proofErr w:type="spellStart"/>
+      <w:r>
+        <w:rPr>
+          <w:lang w:val="en-US"/>
+        </w:rPr>
+        <w:t>aliquip</w:t>
+      </w:r>
+      <w:proofErr w:type="spellEnd"/>
+      <w:r>
+        <w:rPr>
+          <w:lang w:val="en-US"/>
+        </w:rPr>
+        <w:t xml:space="preserve"> ex </w:t>
+      </w:r>
+      <w:proofErr w:type="spellStart"/>
+      <w:r>
+        <w:rPr>
+          <w:lang w:val="en-US"/>
+        </w:rPr>
+        <w:t>ea</w:t>
+      </w:r>
+      <w:proofErr w:type="spellEnd"/>
+      <w:r>
+        <w:rPr>
+          <w:lang w:val="en-US"/>
+        </w:rPr>
+        <w:t xml:space="preserve"> </w:t>
+      </w:r>
+      <w:proofErr w:type="spellStart"/>
+      <w:r>
+        <w:rPr>
+          <w:lang w:val="en-US"/>
+        </w:rPr>
+        <w:t>commodo</w:t>
+      </w:r>
+      <w:proofErr w:type="spellEnd"/>
+      <w:r>
+        <w:rPr>
+          <w:lang w:val="en-US"/>
+        </w:rPr>
+        <w:t xml:space="preserve"> </w:t>
+      </w:r>
+      <w:proofErr w:type="spellStart"/>
+      <w:r>
+        <w:rPr>
+          <w:lang w:val="en-US"/>
+        </w:rPr>
+        <w:t>consequat</w:t>
+      </w:r>
+      <w:proofErr w:type="spellEnd"/>
+      <w:r>
+        <w:rPr>
+          <w:lang w:val="en-US"/>
+        </w:rPr>
+        <w:t xml:space="preserve">. Duis </w:t>
+      </w:r>
+      <w:proofErr w:type="spellStart"/>
+      <w:r>
+        <w:rPr>
+          <w:lang w:val="en-US"/>
+        </w:rPr>
+        <w:t>aute</w:t>
+      </w:r>
+      <w:proofErr w:type="spellEnd"/>
+      <w:r>
+        <w:rPr>
+          <w:lang w:val="en-US"/>
+        </w:rPr>
+        <w:t xml:space="preserve"> </w:t>
+      </w:r>
+      <w:proofErr w:type="spellStart"/>
+      <w:r>
+        <w:rPr>
+          <w:lang w:val="en-US"/>
+        </w:rPr>
+        <w:t>irure</w:t>
+      </w:r>
+      <w:proofErr w:type="spellEnd"/>
+      <w:r>
+        <w:rPr>
+          <w:lang w:val="en-US"/>
+        </w:rPr>
+        <w:t xml:space="preserve"> dolor in </w:t>
+      </w:r>
+      <w:proofErr w:type="spellStart"/>
+      <w:r>
+        <w:rPr>
+          <w:lang w:val="en-US"/>
+        </w:rPr>
+        <w:t>reprehenderit</w:t>
+      </w:r>
+      <w:proofErr w:type="spellEnd"/>
+      <w:r>
+        <w:rPr>
+          <w:lang w:val="en-US"/>
+        </w:rPr>
+        <w:t xml:space="preserve"> in </w:t>
+      </w:r>
+      <w:proofErr w:type="spellStart"/>
+      <w:r>
+        <w:rPr>
+          <w:lang w:val="en-US"/>
+        </w:rPr>
+        <w:t>voluptate</w:t>
+      </w:r>
+      <w:proofErr w:type="spellEnd"/>
+      <w:r>
+        <w:rPr>
+          <w:lang w:val="en-US"/>
+        </w:rPr>
+        <w:t xml:space="preserve"> </w:t>
+      </w:r>
+      <w:proofErr w:type="spellStart"/>
+      <w:r>
+        <w:rPr>
+          <w:lang w:val="en-US"/>
+        </w:rPr>
+        <w:t>velit</w:t>
+      </w:r>
+      <w:proofErr w:type="spellEnd"/>
+      <w:r>
+        <w:rPr>
+          <w:lang w:val="en-US"/>
+        </w:rPr>
+        <w:t xml:space="preserve"> </w:t>
+      </w:r>
+      <w:proofErr w:type="spellStart"/>
+      <w:r>
+        <w:rPr>
+          <w:lang w:val="en-US"/>
+        </w:rPr>
+        <w:t>esse</w:t>
+      </w:r>
+      <w:proofErr w:type="spellEnd"/>
+      <w:r>
+        <w:rPr>
+          <w:lang w:val="en-US"/>
+        </w:rPr>
+        <w:t xml:space="preserve"> </w:t>
+      </w:r>
+      <w:proofErr w:type="spellStart"/>
+      <w:r>
+        <w:rPr>
+          <w:lang w:val="en-US"/>
+        </w:rPr>
+        <w:t>cillum</w:t>
+      </w:r>
+      <w:proofErr w:type="spellEnd"/>
+      <w:r>
+        <w:rPr>
+          <w:lang w:val="en-US"/>
+        </w:rPr>
+        <w:t xml:space="preserve"> dolore </w:t>
+      </w:r>
+      <w:proofErr w:type="spellStart"/>
+      <w:r>
+        <w:rPr>
+          <w:lang w:val="en-US"/>
+        </w:rPr>
+        <w:t>eu</w:t>
+      </w:r>
+      <w:proofErr w:type="spellEnd"/>
+      <w:r>
+        <w:rPr>
+          <w:lang w:val="en-US"/>
+        </w:rPr>
+        <w:t xml:space="preserve"> </w:t>
+      </w:r>
+      <w:proofErr w:type="spellStart"/>
+      <w:r>
+        <w:rPr>
+          <w:lang w:val="en-US"/>
+        </w:rPr>
+        <w:t>fugiat</w:t>
+      </w:r>
+      <w:proofErr w:type="spellEnd"/>
+      <w:r>
+        <w:rPr>
+          <w:lang w:val="en-US"/>
+        </w:rPr>
+        <w:t xml:space="preserve"> </w:t>
+      </w:r>
+      <w:proofErr w:type="spellStart"/>
+      <w:r>
+        <w:rPr>
+          <w:lang w:val="en-US"/>
+        </w:rPr>
+        <w:t>nulla</w:t>
+      </w:r>
+      <w:proofErr w:type="spellEnd"/>
+      <w:r>
+        <w:rPr>
+          <w:lang w:val="en-US"/>
+        </w:rPr>
+        <w:t xml:space="preserve"> </w:t>
+      </w:r>
+      <w:proofErr w:type="spellStart"/>
+      <w:r>
+        <w:rPr>
+          <w:lang w:val="en-US"/>
+        </w:rPr>
+        <w:t>pariatur</w:t>
+      </w:r>
+      <w:proofErr w:type="spellEnd"/>
+      <w:r>
+        <w:rPr>
+          <w:lang w:val="en-US"/>
+        </w:rPr>
+        <w:t xml:space="preserve">. </w:t>
+      </w:r>
+      <w:proofErr w:type="spellStart"/>
+      <w:r>
+        <w:rPr>
+          <w:lang w:val="en-US"/>
+        </w:rPr>
+        <w:t>Excepteur</w:t>
+      </w:r>
+      <w:proofErr w:type="spellEnd"/>
+      <w:r>
+        <w:rPr>
+          <w:lang w:val="en-US"/>
+        </w:rPr>
+        <w:t xml:space="preserve"> </w:t>
+      </w:r>
+      <w:proofErr w:type="spellStart"/>
+      <w:r>
+        <w:rPr>
+          <w:lang w:val="en-US"/>
+        </w:rPr>
+        <w:t>sint</w:t>
+      </w:r>
+      <w:proofErr w:type="spellEnd"/>
+      <w:r>
+        <w:rPr>
+          <w:lang w:val="en-US"/>
+        </w:rPr>
+        <w:t xml:space="preserve"> </w:t>
+      </w:r>
+      <w:proofErr w:type="spellStart"/>
+      <w:r>
+        <w:rPr>
+          <w:lang w:val="en-US"/>
+        </w:rPr>
+        <w:t>occaecat</w:t>
+      </w:r>
+      <w:proofErr w:type="spellEnd"/>
+      <w:r>
+        <w:rPr>
+          <w:lang w:val="en-US"/>
+        </w:rPr>
+        <w:t xml:space="preserve"> </w:t>
+      </w:r>
+      <w:proofErr w:type="spellStart"/>
+      <w:r>
+        <w:rPr>
+          <w:lang w:val="en-US"/>
+        </w:rPr>
+        <w:t>cupidatat</w:t>
+      </w:r>
+      <w:proofErr w:type="spellEnd"/>
+      <w:r>
+        <w:rPr>
+          <w:lang w:val="en-US"/>
+        </w:rPr>
+        <w:t xml:space="preserve"> non </w:t>
+      </w:r>
+      <w:proofErr w:type="spellStart"/>
+      <w:r>
+        <w:rPr>
+          <w:lang w:val="en-US"/>
+        </w:rPr>
+        <w:t>proident</w:t>
+      </w:r>
+      <w:proofErr w:type="spellEnd"/>
+      <w:r>
+        <w:rPr>
+          <w:lang w:val="en-US"/>
+        </w:rPr>
+        <w:t xml:space="preserve">, sunt in culpa qui </w:t>
+      </w:r>
+      <w:proofErr w:type="spellStart"/>
+      <w:r>
+        <w:rPr>
+          <w:lang w:val="en-US"/>
+        </w:rPr>
+        <w:t>officia</w:t>
+      </w:r>
+      <w:proofErr w:type="spellEnd"/>
+      <w:r>
+        <w:rPr>
+          <w:lang w:val="en-US"/>
+        </w:rPr>
+        <w:t xml:space="preserve"> </w:t>
+      </w:r>
+      <w:proofErr w:type="spellStart"/>
+      <w:r>
+        <w:rPr>
+          <w:lang w:val="en-US"/>
+        </w:rPr>
+        <w:t>deserunt</w:t>
+      </w:r>
+      <w:proofErr w:type="spellEnd"/>
+      <w:r>
+        <w:rPr>
+          <w:lang w:val="en-US"/>
+        </w:rPr>
+        <w:t xml:space="preserve"> </w:t>
+      </w:r>
+      <w:proofErr w:type="spellStart"/>
+      <w:r>
+        <w:rPr>
+          <w:lang w:val="en-US"/>
+        </w:rPr>
+        <w:t>mollit</w:t>
+      </w:r>
+      <w:proofErr w:type="spellEnd"/>
+      <w:r>
+        <w:rPr>
+          <w:lang w:val="en-US"/>
+        </w:rPr>
+        <w:t xml:space="preserve"> </w:t>
+      </w:r>
+      <w:proofErr w:type="spellStart"/>
+      <w:r>
+        <w:rPr>
+          <w:lang w:val="en-US"/>
+        </w:rPr>
+        <w:t>anim</w:t>
+      </w:r>
+      <w:proofErr w:type="spellEnd"/>
+      <w:r>
+        <w:rPr>
+          <w:lang w:val="en-US"/>
+        </w:rPr>
+        <w:t xml:space="preserve"> id </w:t>
+      </w:r>
+      <w:proofErr w:type="spellStart"/>
+      <w:r>
+        <w:rPr>
+          <w:lang w:val="en-US"/>
+        </w:rPr>
+        <w:t>est</w:t>
+      </w:r>
+      <w:proofErr w:type="spellEnd"/>
+      <w:r>
+        <w:rPr>
+          <w:lang w:val="en-US"/>
+        </w:rPr>
+        <w:t xml:space="preserve"> </w:t>
+      </w:r>
+      <w:proofErr w:type="spellStart"/>
+      <w:r>
+        <w:rPr>
+          <w:lang w:val="en-US"/>
+        </w:rPr>
+        <w:t>laborum</w:t>
+      </w:r>
+      <w:proofErr w:type="spellEnd"/>
+      <w:r>
+        <w:rPr>
+          <w:lang w:val="en-US"/>
+        </w:rPr>
+        <w:t>.</w:t>
       </w:r>
     </w:p>
     <w:p/>
@@ -5453,7 +7265,7 @@
                     <pic:cNvPicPr preferRelativeResize="0"/>
                   </pic:nvPicPr>
                   <pic:blipFill>
-                    <a:blip r:embed="rId38"/>
+                    <a:blip r:embed="rId43"/>
                     <a:srcRect/>
                     <a:stretch>
                       <a:fillRect/>
@@ -5494,7 +7306,595 @@
         <w:rPr>
           <w:lang w:val="en-US"/>
         </w:rPr>
-        <w:t>Lorem ipsum dolor sit amet, consectetur adipiscing elit, sed do eiusmod tempor incididunt ut labore et dolore magna aliqua. Ut enim ad minim veniam, quis nostrud exercitation ullamco laboris nisi ut aliquip ex ea commodo consequat. Duis aute irure dolor in reprehenderit in voluptate velit esse cillum dolore eu fugiat nulla pariatur. Excepteur sint occaecat cupidatat non proident, sunt in culpa qui officia deserunt mollit anim id est laborum.</w:t>
+        <w:t xml:space="preserve">Lorem ipsum dolor sit </w:t>
+      </w:r>
+      <w:proofErr w:type="spellStart"/>
+      <w:r>
+        <w:rPr>
+          <w:lang w:val="en-US"/>
+        </w:rPr>
+        <w:t>amet</w:t>
+      </w:r>
+      <w:proofErr w:type="spellEnd"/>
+      <w:r>
+        <w:rPr>
+          <w:lang w:val="en-US"/>
+        </w:rPr>
+        <w:t xml:space="preserve">, </w:t>
+      </w:r>
+      <w:proofErr w:type="spellStart"/>
+      <w:r>
+        <w:rPr>
+          <w:lang w:val="en-US"/>
+        </w:rPr>
+        <w:t>consectetur</w:t>
+      </w:r>
+      <w:proofErr w:type="spellEnd"/>
+      <w:r>
+        <w:rPr>
+          <w:lang w:val="en-US"/>
+        </w:rPr>
+        <w:t xml:space="preserve"> </w:t>
+      </w:r>
+      <w:proofErr w:type="spellStart"/>
+      <w:r>
+        <w:rPr>
+          <w:lang w:val="en-US"/>
+        </w:rPr>
+        <w:t>adipiscing</w:t>
+      </w:r>
+      <w:proofErr w:type="spellEnd"/>
+      <w:r>
+        <w:rPr>
+          <w:lang w:val="en-US"/>
+        </w:rPr>
+        <w:t xml:space="preserve"> </w:t>
+      </w:r>
+      <w:proofErr w:type="spellStart"/>
+      <w:r>
+        <w:rPr>
+          <w:lang w:val="en-US"/>
+        </w:rPr>
+        <w:t>elit</w:t>
+      </w:r>
+      <w:proofErr w:type="spellEnd"/>
+      <w:r>
+        <w:rPr>
+          <w:lang w:val="en-US"/>
+        </w:rPr>
+        <w:t xml:space="preserve">, sed do </w:t>
+      </w:r>
+      <w:proofErr w:type="spellStart"/>
+      <w:r>
+        <w:rPr>
+          <w:lang w:val="en-US"/>
+        </w:rPr>
+        <w:t>eiusmod</w:t>
+      </w:r>
+      <w:proofErr w:type="spellEnd"/>
+      <w:r>
+        <w:rPr>
+          <w:lang w:val="en-US"/>
+        </w:rPr>
+        <w:t xml:space="preserve"> </w:t>
+      </w:r>
+      <w:proofErr w:type="spellStart"/>
+      <w:r>
+        <w:rPr>
+          <w:lang w:val="en-US"/>
+        </w:rPr>
+        <w:t>tempor</w:t>
+      </w:r>
+      <w:proofErr w:type="spellEnd"/>
+      <w:r>
+        <w:rPr>
+          <w:lang w:val="en-US"/>
+        </w:rPr>
+        <w:t xml:space="preserve"> </w:t>
+      </w:r>
+      <w:proofErr w:type="spellStart"/>
+      <w:r>
+        <w:rPr>
+          <w:lang w:val="en-US"/>
+        </w:rPr>
+        <w:t>incididunt</w:t>
+      </w:r>
+      <w:proofErr w:type="spellEnd"/>
+      <w:r>
+        <w:rPr>
+          <w:lang w:val="en-US"/>
+        </w:rPr>
+        <w:t xml:space="preserve"> </w:t>
+      </w:r>
+      <w:proofErr w:type="spellStart"/>
+      <w:r>
+        <w:rPr>
+          <w:lang w:val="en-US"/>
+        </w:rPr>
+        <w:t>ut</w:t>
+      </w:r>
+      <w:proofErr w:type="spellEnd"/>
+      <w:r>
+        <w:rPr>
+          <w:lang w:val="en-US"/>
+        </w:rPr>
+        <w:t xml:space="preserve"> labore et dolore magna </w:t>
+      </w:r>
+      <w:proofErr w:type="spellStart"/>
+      <w:r>
+        <w:rPr>
+          <w:lang w:val="en-US"/>
+        </w:rPr>
+        <w:t>aliqua</w:t>
+      </w:r>
+      <w:proofErr w:type="spellEnd"/>
+      <w:r>
+        <w:rPr>
+          <w:lang w:val="en-US"/>
+        </w:rPr>
+        <w:t xml:space="preserve">. Ut </w:t>
+      </w:r>
+      <w:proofErr w:type="spellStart"/>
+      <w:r>
+        <w:rPr>
+          <w:lang w:val="en-US"/>
+        </w:rPr>
+        <w:t>enim</w:t>
+      </w:r>
+      <w:proofErr w:type="spellEnd"/>
+      <w:r>
+        <w:rPr>
+          <w:lang w:val="en-US"/>
+        </w:rPr>
+        <w:t xml:space="preserve"> ad minim </w:t>
+      </w:r>
+      <w:proofErr w:type="spellStart"/>
+      <w:r>
+        <w:rPr>
+          <w:lang w:val="en-US"/>
+        </w:rPr>
+        <w:t>veniam</w:t>
+      </w:r>
+      <w:proofErr w:type="spellEnd"/>
+      <w:r>
+        <w:rPr>
+          <w:lang w:val="en-US"/>
+        </w:rPr>
+        <w:t xml:space="preserve">, </w:t>
+      </w:r>
+      <w:proofErr w:type="spellStart"/>
+      <w:r>
+        <w:rPr>
+          <w:lang w:val="en-US"/>
+        </w:rPr>
+        <w:t>quis</w:t>
+      </w:r>
+      <w:proofErr w:type="spellEnd"/>
+      <w:r>
+        <w:rPr>
+          <w:lang w:val="en-US"/>
+        </w:rPr>
+        <w:t xml:space="preserve"> </w:t>
+      </w:r>
+      <w:proofErr w:type="spellStart"/>
+      <w:r>
+        <w:rPr>
+          <w:lang w:val="en-US"/>
+        </w:rPr>
+        <w:t>nostrud</w:t>
+      </w:r>
+      <w:proofErr w:type="spellEnd"/>
+      <w:r>
+        <w:rPr>
+          <w:lang w:val="en-US"/>
+        </w:rPr>
+        <w:t xml:space="preserve"> exercitation </w:t>
+      </w:r>
+      <w:proofErr w:type="spellStart"/>
+      <w:r>
+        <w:rPr>
+          <w:lang w:val="en-US"/>
+        </w:rPr>
+        <w:t>ullamco</w:t>
+      </w:r>
+      <w:proofErr w:type="spellEnd"/>
+      <w:r>
+        <w:rPr>
+          <w:lang w:val="en-US"/>
+        </w:rPr>
+        <w:t xml:space="preserve"> </w:t>
+      </w:r>
+      <w:proofErr w:type="spellStart"/>
+      <w:r>
+        <w:rPr>
+          <w:lang w:val="en-US"/>
+        </w:rPr>
+        <w:t>laboris</w:t>
+      </w:r>
+      <w:proofErr w:type="spellEnd"/>
+      <w:r>
+        <w:rPr>
+          <w:lang w:val="en-US"/>
+        </w:rPr>
+        <w:t xml:space="preserve"> nisi </w:t>
+      </w:r>
+      <w:proofErr w:type="spellStart"/>
+      <w:r>
+        <w:rPr>
+          <w:lang w:val="en-US"/>
+        </w:rPr>
+        <w:t>ut</w:t>
+      </w:r>
+      <w:proofErr w:type="spellEnd"/>
+      <w:r>
+        <w:rPr>
+          <w:lang w:val="en-US"/>
+        </w:rPr>
+        <w:t xml:space="preserve"> </w:t>
+      </w:r>
+      <w:proofErr w:type="spellStart"/>
+      <w:r>
+        <w:rPr>
+          <w:lang w:val="en-US"/>
+        </w:rPr>
+        <w:t>aliquip</w:t>
+      </w:r>
+      <w:proofErr w:type="spellEnd"/>
+      <w:r>
+        <w:rPr>
+          <w:lang w:val="en-US"/>
+        </w:rPr>
+        <w:t xml:space="preserve"> ex </w:t>
+      </w:r>
+      <w:proofErr w:type="spellStart"/>
+      <w:r>
+        <w:rPr>
+          <w:lang w:val="en-US"/>
+        </w:rPr>
+        <w:t>ea</w:t>
+      </w:r>
+      <w:proofErr w:type="spellEnd"/>
+      <w:r>
+        <w:rPr>
+          <w:lang w:val="en-US"/>
+        </w:rPr>
+        <w:t xml:space="preserve"> </w:t>
+      </w:r>
+      <w:proofErr w:type="spellStart"/>
+      <w:r>
+        <w:rPr>
+          <w:lang w:val="en-US"/>
+        </w:rPr>
+        <w:t>commodo</w:t>
+      </w:r>
+      <w:proofErr w:type="spellEnd"/>
+      <w:r>
+        <w:rPr>
+          <w:lang w:val="en-US"/>
+        </w:rPr>
+        <w:t xml:space="preserve"> </w:t>
+      </w:r>
+      <w:proofErr w:type="spellStart"/>
+      <w:r>
+        <w:rPr>
+          <w:lang w:val="en-US"/>
+        </w:rPr>
+        <w:t>consequat</w:t>
+      </w:r>
+      <w:proofErr w:type="spellEnd"/>
+      <w:r>
+        <w:rPr>
+          <w:lang w:val="en-US"/>
+        </w:rPr>
+        <w:t xml:space="preserve">. Duis </w:t>
+      </w:r>
+      <w:proofErr w:type="spellStart"/>
+      <w:r>
+        <w:rPr>
+          <w:lang w:val="en-US"/>
+        </w:rPr>
+        <w:t>aute</w:t>
+      </w:r>
+      <w:proofErr w:type="spellEnd"/>
+      <w:r>
+        <w:rPr>
+          <w:lang w:val="en-US"/>
+        </w:rPr>
+        <w:t xml:space="preserve"> </w:t>
+      </w:r>
+      <w:proofErr w:type="spellStart"/>
+      <w:r>
+        <w:rPr>
+          <w:lang w:val="en-US"/>
+        </w:rPr>
+        <w:t>irure</w:t>
+      </w:r>
+      <w:proofErr w:type="spellEnd"/>
+      <w:r>
+        <w:rPr>
+          <w:lang w:val="en-US"/>
+        </w:rPr>
+        <w:t xml:space="preserve"> dolor in </w:t>
+      </w:r>
+      <w:proofErr w:type="spellStart"/>
+      <w:r>
+        <w:rPr>
+          <w:lang w:val="en-US"/>
+        </w:rPr>
+        <w:t>reprehenderit</w:t>
+      </w:r>
+      <w:proofErr w:type="spellEnd"/>
+      <w:r>
+        <w:rPr>
+          <w:lang w:val="en-US"/>
+        </w:rPr>
+        <w:t xml:space="preserve"> in </w:t>
+      </w:r>
+      <w:proofErr w:type="spellStart"/>
+      <w:r>
+        <w:rPr>
+          <w:lang w:val="en-US"/>
+        </w:rPr>
+        <w:t>voluptate</w:t>
+      </w:r>
+      <w:proofErr w:type="spellEnd"/>
+      <w:r>
+        <w:rPr>
+          <w:lang w:val="en-US"/>
+        </w:rPr>
+        <w:t xml:space="preserve"> </w:t>
+      </w:r>
+      <w:proofErr w:type="spellStart"/>
+      <w:r>
+        <w:rPr>
+          <w:lang w:val="en-US"/>
+        </w:rPr>
+        <w:t>velit</w:t>
+      </w:r>
+      <w:proofErr w:type="spellEnd"/>
+      <w:r>
+        <w:rPr>
+          <w:lang w:val="en-US"/>
+        </w:rPr>
+        <w:t xml:space="preserve"> </w:t>
+      </w:r>
+      <w:proofErr w:type="spellStart"/>
+      <w:r>
+        <w:rPr>
+          <w:lang w:val="en-US"/>
+        </w:rPr>
+        <w:t>esse</w:t>
+      </w:r>
+      <w:proofErr w:type="spellEnd"/>
+      <w:r>
+        <w:rPr>
+          <w:lang w:val="en-US"/>
+        </w:rPr>
+        <w:t xml:space="preserve"> </w:t>
+      </w:r>
+      <w:proofErr w:type="spellStart"/>
+      <w:r>
+        <w:rPr>
+          <w:lang w:val="en-US"/>
+        </w:rPr>
+        <w:t>cillum</w:t>
+      </w:r>
+      <w:proofErr w:type="spellEnd"/>
+      <w:r>
+        <w:rPr>
+          <w:lang w:val="en-US"/>
+        </w:rPr>
+        <w:t xml:space="preserve"> dolore </w:t>
+      </w:r>
+      <w:proofErr w:type="spellStart"/>
+      <w:r>
+        <w:rPr>
+          <w:lang w:val="en-US"/>
+        </w:rPr>
+        <w:t>eu</w:t>
+      </w:r>
+      <w:proofErr w:type="spellEnd"/>
+      <w:r>
+        <w:rPr>
+          <w:lang w:val="en-US"/>
+        </w:rPr>
+        <w:t xml:space="preserve"> </w:t>
+      </w:r>
+      <w:proofErr w:type="spellStart"/>
+      <w:r>
+        <w:rPr>
+          <w:lang w:val="en-US"/>
+        </w:rPr>
+        <w:t>fugiat</w:t>
+      </w:r>
+      <w:proofErr w:type="spellEnd"/>
+      <w:r>
+        <w:rPr>
+          <w:lang w:val="en-US"/>
+        </w:rPr>
+        <w:t xml:space="preserve"> </w:t>
+      </w:r>
+      <w:proofErr w:type="spellStart"/>
+      <w:r>
+        <w:rPr>
+          <w:lang w:val="en-US"/>
+        </w:rPr>
+        <w:t>nulla</w:t>
+      </w:r>
+      <w:proofErr w:type="spellEnd"/>
+      <w:r>
+        <w:rPr>
+          <w:lang w:val="en-US"/>
+        </w:rPr>
+        <w:t xml:space="preserve"> </w:t>
+      </w:r>
+      <w:proofErr w:type="spellStart"/>
+      <w:r>
+        <w:rPr>
+          <w:lang w:val="en-US"/>
+        </w:rPr>
+        <w:t>pariatur</w:t>
+      </w:r>
+      <w:proofErr w:type="spellEnd"/>
+      <w:r>
+        <w:rPr>
+          <w:lang w:val="en-US"/>
+        </w:rPr>
+        <w:t xml:space="preserve">. </w:t>
+      </w:r>
+      <w:proofErr w:type="spellStart"/>
+      <w:r>
+        <w:rPr>
+          <w:lang w:val="en-US"/>
+        </w:rPr>
+        <w:t>Excepteur</w:t>
+      </w:r>
+      <w:proofErr w:type="spellEnd"/>
+      <w:r>
+        <w:rPr>
+          <w:lang w:val="en-US"/>
+        </w:rPr>
+        <w:t xml:space="preserve"> </w:t>
+      </w:r>
+      <w:proofErr w:type="spellStart"/>
+      <w:r>
+        <w:rPr>
+          <w:lang w:val="en-US"/>
+        </w:rPr>
+        <w:t>sint</w:t>
+      </w:r>
+      <w:proofErr w:type="spellEnd"/>
+      <w:r>
+        <w:rPr>
+          <w:lang w:val="en-US"/>
+        </w:rPr>
+        <w:t xml:space="preserve"> </w:t>
+      </w:r>
+      <w:proofErr w:type="spellStart"/>
+      <w:r>
+        <w:rPr>
+          <w:lang w:val="en-US"/>
+        </w:rPr>
+        <w:t>occaecat</w:t>
+      </w:r>
+      <w:proofErr w:type="spellEnd"/>
+      <w:r>
+        <w:rPr>
+          <w:lang w:val="en-US"/>
+        </w:rPr>
+        <w:t xml:space="preserve"> </w:t>
+      </w:r>
+      <w:proofErr w:type="spellStart"/>
+      <w:r>
+        <w:rPr>
+          <w:lang w:val="en-US"/>
+        </w:rPr>
+        <w:t>cupidatat</w:t>
+      </w:r>
+      <w:proofErr w:type="spellEnd"/>
+      <w:r>
+        <w:rPr>
+          <w:lang w:val="en-US"/>
+        </w:rPr>
+        <w:t xml:space="preserve"> non </w:t>
+      </w:r>
+      <w:proofErr w:type="spellStart"/>
+      <w:r>
+        <w:rPr>
+          <w:lang w:val="en-US"/>
+        </w:rPr>
+        <w:t>proident</w:t>
+      </w:r>
+      <w:proofErr w:type="spellEnd"/>
+      <w:r>
+        <w:rPr>
+          <w:lang w:val="en-US"/>
+        </w:rPr>
+        <w:t xml:space="preserve">, sunt in culpa qui </w:t>
+      </w:r>
+      <w:proofErr w:type="spellStart"/>
+      <w:r>
+        <w:rPr>
+          <w:lang w:val="en-US"/>
+        </w:rPr>
+        <w:t>officia</w:t>
+      </w:r>
+      <w:proofErr w:type="spellEnd"/>
+      <w:r>
+        <w:rPr>
+          <w:lang w:val="en-US"/>
+        </w:rPr>
+        <w:t xml:space="preserve"> </w:t>
+      </w:r>
+      <w:proofErr w:type="spellStart"/>
+      <w:r>
+        <w:rPr>
+          <w:lang w:val="en-US"/>
+        </w:rPr>
+        <w:t>deserunt</w:t>
+      </w:r>
+      <w:proofErr w:type="spellEnd"/>
+      <w:r>
+        <w:rPr>
+          <w:lang w:val="en-US"/>
+        </w:rPr>
+        <w:t xml:space="preserve"> </w:t>
+      </w:r>
+      <w:proofErr w:type="spellStart"/>
+      <w:r>
+        <w:rPr>
+          <w:lang w:val="en-US"/>
+        </w:rPr>
+        <w:t>mollit</w:t>
+      </w:r>
+      <w:proofErr w:type="spellEnd"/>
+      <w:r>
+        <w:rPr>
+          <w:lang w:val="en-US"/>
+        </w:rPr>
+        <w:t xml:space="preserve"> </w:t>
+      </w:r>
+      <w:proofErr w:type="spellStart"/>
+      <w:r>
+        <w:rPr>
+          <w:lang w:val="en-US"/>
+        </w:rPr>
+        <w:t>anim</w:t>
+      </w:r>
+      <w:proofErr w:type="spellEnd"/>
+      <w:r>
+        <w:rPr>
+          <w:lang w:val="en-US"/>
+        </w:rPr>
+        <w:t xml:space="preserve"> id </w:t>
+      </w:r>
+      <w:proofErr w:type="spellStart"/>
+      <w:r>
+        <w:rPr>
+          <w:lang w:val="en-US"/>
+        </w:rPr>
+        <w:t>est</w:t>
+      </w:r>
+      <w:proofErr w:type="spellEnd"/>
+      <w:r>
+        <w:rPr>
+          <w:lang w:val="en-US"/>
+        </w:rPr>
+        <w:t xml:space="preserve"> </w:t>
+      </w:r>
+      <w:proofErr w:type="spellStart"/>
+      <w:r>
+        <w:rPr>
+          <w:lang w:val="en-US"/>
+        </w:rPr>
+        <w:t>laborum</w:t>
+      </w:r>
+      <w:proofErr w:type="spellEnd"/>
+      <w:r>
+        <w:rPr>
+          <w:lang w:val="en-US"/>
+        </w:rPr>
+        <w:t>.</w:t>
       </w:r>
     </w:p>
     <w:p/>
@@ -5767,7 +8167,7 @@
                     </pic:cNvPicPr>
                   </pic:nvPicPr>
                   <pic:blipFill>
-                    <a:blip r:embed="rId39">
+                    <a:blip r:embed="rId42">
                       <a:extLst>
                         <a:ext uri="{28A0092B-C50C-407E-A947-70E740481C1C}">
                           <a14:useLocalDpi xmlns:a14="http://schemas.microsoft.com/office/drawing/2010/main" val="0"/>

</xml_diff>